<commit_message>
Revise seminar against academic writing and APA 7 checklist
Move first person out of the body chapters, convert eleven under-length
block quotes to inline quotes with quotation marks per the 40-word rule,
replace filler phrases and flagged vocabulary, split overlong paragraphs,
and vary mechanical paragraph openers.

Add a pre-submission checklist recording the two-way citation cross-check,
the formatting requirements, and the items that still need manual completion.

Co-Authored-By: Claude Opus 5 <noreply@anthropic.com>
Claude-Session: https://claude.ai/code/session_01UzBsN33oywctKHTFxV8Z7L
</commit_message>
<xml_diff>
--- a/research/parent-teacher-communication/seminar/סמינריון - יחסי הורים גננת בחברה הבדואית.docx
+++ b/research/parent-teacher-communication/seminar/סמינריון - יחסי הורים גננת בחברה הבדואית.docx
@@ -292,7 +292,7 @@
         <w:rPr>
           <w:cs/>
         </w:rPr>
-        <w:t>ילדים צעירים נולדים עם פוטנציאל ותשוקה ללמידה. כבר בגיל הרך הם מסוגלים לחקור את סביבתם ולהתנסות בה באופן עצמאי, ומאוחר יותר גם לחקור את עולמם הפנימי ואת עולמם של אחרים. היכולת הזאת נשענת על הידיעה שיש על מי לסמוך ולמי לפנות לנחמה בעת צרה (ארז, 2011). תקופת הגיל הרך מניחה את היסודות להתפתחות הילד, והיא קריטית לעיצוב אישיותו ולהישגיו בעתיד (ואזן-סיקרון ואחרים, 2014).</w:t>
+        <w:t>ילדים צעירים נולדים עם פוטנציאל ותשוקה ללמידה. כבר בגיל הרך הם מסוגלים לחקור את סביבתם ולהתנסות בה באופן עצמאי, ומאוחר יותר גם לחקור את עולמם הפנימי ואת עולמם של אחרים. היכולת הזאת נשענת על הידיעה שיש על מי לסמוך ולמי לפנות לנחמה בעת צרה (ארז, 2011). תקופת הגיל הרך מניחה את היסודות להתפתחות הילד, ויש לה משקל רב בעיצוב אישיותו ובהישגיו בעתיד (ואזן-סיקרון ואחרים, 2014).</w:t>
       </w:r>
     </w:p>
     <w:p>
@@ -390,7 +390,7 @@
         <w:rPr>
           <w:cs/>
         </w:rPr>
-        <w:t>הדימוי שההורים מייחסים לגננת משפיע אף הוא על אופי הקשר. מחקר כמותי שנערך בקרב 289 הורים לילדים בגני טרום חובה וחובה, באמצעות שאלון מקוון, מצא תמונה מורכבת של מעמד הגננת בעיני הורים ופערים ניכרים בין הממדים המרכיבים דימוי זה. מצד אחד המקצוע נתפס כמצריך רמה גבוהה של מקצועיות וכתורם רבות לחברה, ומצד שני ההערכה המקצועית והאישית המיוחסת לגננת אינה אחידה. המחקר מצביע גם על הזיקה בין תחושת הביטחון המקצועי של הגננת לבין אופי השיח שהיא מנהלת מול ההורים (גילת ואחרים, 2017). מעורבות הורים בגיל הרך נתפסת כמרכזית להתפתחות האקדמית המוקדמת של הילדים, וטיפוחה הוא מטרה של מערכות חינוך רבות. הורים המעורבים בחינוך ילדיהם בגיל הרך יודעים יותר על פעילויות הגן, ולכן מסוגלים להשלים טוב יותר את הלמידה המתרחשת בו (Arnold et al., 2008).</w:t>
+        <w:t>הדימוי שההורים מייחסים לגננת משפיע אף הוא על אופי הקשר. מחקר כמותי שנערך בקרב 289 הורים לילדים בגני טרום חובה וחובה, באמצעות שאלון מקוון, מצא תמונה מורכבת של מעמד הגננת בעיני הורים ופערים ניכרים בין הממדים המרכיבים דימוי זה. מצד אחד המקצוע נתפס כמצריך רמה גבוהה של מקצועיות וכתורם רבות לחברה, ומצד שני ההערכה המקצועית והאישית המיוחסת לגננת אינה אחידה. המחקר מצביע גם על הזיקה בין תחושת הביטחון המקצועי של הגננת לבין אופי השיח שהיא מנהלת מול ההורים (גילת ואחרים, 2017). מעורבות הורים בגיל הרך נתפסת כמרכזית להתפתחות האקדמית המוקדמת של הילדים, ומערכות חינוך רבות מציבות את עידודה כמטרה. הורים המעורבים בחינוך ילדיהם בגיל הרך יודעים יותר על פעילויות הגן, ולכן מסוגלים להשלים טוב יותר את הלמידה המתרחשת בו (Arnold et al., 2008).</w:t>
       </w:r>
     </w:p>
     <w:p>
@@ -463,7 +463,7 @@
         <w:rPr>
           <w:cs/>
         </w:rPr>
-        <w:t>בתוכניות התערבות להורים לילדים בגיל הרך קיימות אסטרטגיות שונות: עבודה ישירה עם ההורה או עבודה דיאדית הורה-ילד, הדרכת הורים, ייעוץ ותמיכה רגשית, והפניה לשירותים חיצוניים. תוכניות מוצלחות משלבות הקניית ידע לצד תמיכה רגשית (ואזן-סיקרון ואחרים, 2014). שותפות מקדמת בין הגן למשפחה מציבה במרכזה את טובת הילד. היא כוללת הקשבה הדדית, למידה של הצרכים והמאפיינים של המשפחות, דיאלוג על הציפיות מהקשר, וטיפוח יחסי "תן וקח" על בסיס הכישורים של כל צד (שופר-אנגלהרד, 2013).</w:t>
+        <w:t>בתוכניות התערבות להורים לילדים בגיל הרך קיימות אסטרטגיות שונות: עבודה ישירה עם ההורה או עבודה דיאדית הורה-ילד, הדרכת הורים, ייעוץ ותמיכה רגשית, והפניה לשירותים חיצוניים. תוכניות מוצלחות משלבות הקניית ידע עם תמיכה רגשית (ואזן-סיקרון ואחרים, 2014). שותפות מקדמת בין הגן למשפחה מציבה במרכזה את טובת הילד. היא כוללת הקשבה הדדית, למידה של הצרכים והמאפיינים של המשפחות, דיאלוג על הציפיות מהקשר, וטיפוח יחסי "תן וקח" על בסיס הכישורים של כל צד (שופר-אנגלהרד, 2013).</w:t>
       </w:r>
     </w:p>
     <w:p>
@@ -512,7 +512,7 @@
         <w:rPr>
           <w:cs/>
         </w:rPr>
-        <w:t>מחקרים עדכניים מדייקים את אופן הפעולה של הקשר הזה. מחקר ישראלי שבחן את רשת היחסים בין הילד, האם, האב והגננת בגן מנקודת מבט אקולוגית מצא שכל היחסים הקרובים בסביבת הילד, ובכללם יחסי הגננת עם האם ועם האב, קשורים לתוצאות ההתפתחותיות של הילד בתחום החברתי ובתחום הלימודי. הממצא מלמד שהקשר בין ההורה לגננת אינו נפרד מרשת היחסים של הילד אלא חלק ממנה (Weisberger &amp; Ziv, 2023). מחקר שבחן 1,784 הורים לילדי גן באמצעות מידול משוואות מבניות מצא מתאם שלילי בין איכות הקשר שההורים חווים עם הגננת לבין בעיות התנהגות חברתית של ילדיהם, כלומר ככל שההורה חווה קשר טוב יותר עם הגננת, כך הילד מגלה פחות קשיים חברתיים. עוד נמצא שהקשר הזה פועל בשרשרת: יחסים טובים עם הגננת מפחיתים את קונפליקט העבודה-משפחה של ההורה, הפחתה זו מעלה את תחושת המסוגלות ההורית, ותחושת המסוגלות מצמצמת את בעיות ההתנהגות של הילד (Liu et al., 2024). ממצא זה חשוב במיוחד להורים עובדים, משום שהוא מציב את עומס העבודה של ההורה בתוך המנגנון ולא מחוצה לו.</w:t>
+        <w:t>מחקרים עדכניים מדייקים את אופן הפעולה של הקשר הזה. מחקר ישראלי שבחן את רשת היחסים בין הילד, האם, האב והגננת בגן מנקודת מבט אקולוגית מצא שכל היחסים הקרובים בסביבת הילד, ובכללם יחסי הגננת עם האם ועם האב, קשורים לתוצאות ההתפתחותיות של הילד בתחום החברתי ובתחום הלימודי. הממצא מלמד שהקשר בין ההורה לגננת אינו נפרד מרשת היחסים של הילד אלא חלק ממנה (Weisberger &amp; Ziv, 2023).</w:t>
       </w:r>
     </w:p>
     <w:p>
@@ -524,7 +524,19 @@
         <w:rPr>
           <w:cs/>
         </w:rPr>
-        <w:t>מחקר נוסף בחן 167 גננות ו-1,019 ילדי גן והוריהם, והבחין בין הקשר כפי שההורה תופס אותו לבין הקשר כפי שהגננת תופסת אותו. נמצא ששלושה סוגי מעורבות, מעורבות ביתית, מעורבות במסגרת החינוכית ושיח בית-גן, קשורים כולם באופן חיובי לתכונות האופי החיוביות של הילד. יתרה מכך, הקשר שהגננת חווה עם המשפחה מיתן את הזיקה בין המעורבות הביתית לבין התוצאות אצל הילד, כלומר מה שההורה עושה בבית מתורגם לתוצאה אצל הילד ביתר עוצמה כאשר הגננת חווה את הקשר עם המשפחה כטוב (Cai et al., 2024). הבחנה זו בין שתי נקודות המבט על אותו קשר מלמדת שאין די בכך שההורה מרוצה מהקשר.</w:t>
+        <w:t>מחקר שבחן 1,784 הורים לילדי גן באמצעות מידול משוואות מבניות מצא מתאם שלילי בין איכות הקשר שההורים חווים עם הגננת לבין בעיות התנהגות חברתית של ילדיהם, כלומר ככל שההורה חווה קשר טוב יותר עם הגננת, כך הילד מגלה פחות קשיים חברתיים. עוד נמצא שהקשר הזה פועל בשרשרת: יחסים טובים עם הגננת מפחיתים את קונפליקט העבודה-משפחה של ההורה, הפחתה זו מעלה את תחושת המסוגלות ההורית, ותחושת המסוגלות מצמצמת את בעיות ההתנהגות של הילד (Liu et al., 2024). ממצא זה חשוב במיוחד להורים עובדים, משום שהוא מציב את עומס העבודה של ההורה בתוך המנגנון ולא מחוצה לו.</w:t>
+      </w:r>
+    </w:p>
+    <w:p>
+      <w:pPr>
+        <w:bidi w:val="1"/>
+        <w:jc w:val="both"/>
+      </w:pPr>
+      <w:r>
+        <w:rPr>
+          <w:cs/>
+        </w:rPr>
+        <w:t>מחקר נוסף בחן 167 גננות ו-1,019 ילדי גן והוריהם, והבחין בין הקשר כפי שההורה תופס אותו לבין הקשר כפי שהגננת תופסת אותו. נמצא ששלושה סוגי מעורבות, מעורבות ביתית, מעורבות במסגרת החינוכית ושיח בית-גן, קשורים כולם באופן חיובי לתכונות האופי החיוביות של הילד. נמצא גם שהקשר שהגננת חווה עם המשפחה מיתן את הזיקה בין המעורבות הביתית לבין התוצאות אצל הילד, כלומר מה שההורה עושה בבית מתורגם לתוצאה אצל הילד ביתר עוצמה כאשר הגננת חווה את הקשר עם המשפחה כטוב (Cai et al., 2024). הבחנה זו בין שתי נקודות המבט על אותו קשר מלמדת שאין די בכך שההורה מרוצה מהקשר.</w:t>
       </w:r>
     </w:p>
     <w:p>
@@ -808,7 +820,7 @@
         <w:rPr>
           <w:cs/>
         </w:rPr>
-        <w:t>שלושה מחקרים עדכניים עוסקים ישירות בחברה הבדואית בנגב ומדגימים כיצד התשתית הפיזית מעצבת את הקשר. מחקר איכותני שבחן את יחסי המורים וההורים במערכת החינוך הערבית-הבדואית בתקופת מגפת הקורונה מצא שבחברה זו הקשר בין הבית למוסד החינוכי היה מסורתית מצומצם, ושבעקבות המגפה נוצרה אינטראקציה משמעותית בין הורים למורים שהתבטאה בהגברת שיתופי הפעולה ובהעצמת מעורבות ההורים. המורים זיהו תרומה ייחודית של ההורים לתהליך הלמידה והציעו לקיים סדנאות משותפות. לצד זאת המחקר מדגיש חסמים מבניים ייחודיים לחברה הבדואית, ובהם מחסור בחשמל ובתשתיות, פערים דיגיטליים ותמיכה כספית וטכנית בלתי מספקת, במיוחד בכפרים הלא מוכרים (אבו-גוידר, 2025). מחקר איכותני שהתבסס על ראיונות עם עשרים מורים ממערכת החינוך הערבית-בדואית בכפרים הלא-מוכרים תיאר את ההקשר המבני כגורם קובע: בכפרים אלה מבנים אינם מוכרים רשמית וחיבור לתשתיות מים וחשמל חסום מבחינה חוקית, ומכאן מחסור חמור בשירותי בריאות, חינוך ותעסוקה, המגביל ישירות את סוג הקשר שאפשר לקיים בין הצוות החינוכי למשפחות. נמצא שבתנאי המשבר המורים אימצו יותר ויותר טכנולוגיות מידע כאמצעי תקשורת אמין, ובכך בנו רשת חברתית המקשרת בין מורים, הורים ותלמידים (Abu-Gweder &amp; Solomovich, 2025). מחקר איכותני נוסף, שהתבסס על עשרים ראיונות חצי-מובנים עם גננות ערביות-בדואיות בגני חובה וטרום חובה, בחן את התקשורת בין הגננות להורים ומצא שהוואטסאפ הפך לאמצעי המרכזי לקיום הקשר החינוכי עם המשפחות (Elkashalla et al., 2026). שני המחקרים יחד מלמדים שבחברה הבדואית ערוץ הקשר עצמו הוא סוגיה מחקרית, ולא רק תוכנו.</w:t>
+        <w:t>שלושה מחקרים עדכניים עוסקים ישירות בחברה הבדואית בנגב ומדגימים כיצד התשתית הפיזית מעצבת את הקשר. מחקר איכותני שבחן את יחסי המורים וההורים במערכת החינוך הערבית-הבדואית בתקופת מגפת הקורונה מצא שבחברה זו הקשר בין הבית למוסד החינוכי היה מסורתית מצומצם, ושבעקבות המגפה נוצרה אינטראקציה משמעותית בין הורים למורים שהתבטאה בהגברת שיתופי הפעולה ובהעצמת מעורבות ההורים. המורים זיהו תרומה ייחודית של ההורים לתהליך הלמידה והציעו לקיים סדנאות משותפות. לצד זאת המחקר מדגיש חסמים מבניים ייחודיים לחברה הבדואית, ובהם מחסור בחשמל ובתשתיות, פערים דיגיטליים ותמיכה כספית וטכנית בלתי מספקת, במיוחד בכפרים הלא מוכרים (אבו-גוידר, 2025).</w:t>
       </w:r>
     </w:p>
     <w:p>
@@ -820,6 +832,30 @@
         <w:rPr>
           <w:cs/>
         </w:rPr>
+        <w:t>מחקר איכותני שהתבסס על ראיונות עם עשרים מורים ממערכת החינוך הערבית-בדואית בכפרים הלא-מוכרים תיאר את ההקשר המבני כגורם קובע: בכפרים אלה מבנים אינם מוכרים רשמית וחיבור לתשתיות מים וחשמל חסום מבחינה חוקית, ומכאן מחסור חמור בשירותי בריאות, חינוך ותעסוקה, המגביל ישירות את סוג הקשר שאפשר לקיים בין הצוות החינוכי למשפחות. נמצא שבתנאי המשבר המורים אימצו יותר ויותר טכנולוגיות מידע כאמצעי תקשורת אמין, ובכך בנו רשת חברתית המקשרת בין מורים, הורים ותלמידים (Abu-Gweder &amp; Solomovich, 2025).</w:t>
+      </w:r>
+    </w:p>
+    <w:p>
+      <w:pPr>
+        <w:bidi w:val="1"/>
+        <w:jc w:val="both"/>
+      </w:pPr>
+      <w:r>
+        <w:rPr>
+          <w:cs/>
+        </w:rPr>
+        <w:t>מחקר איכותני נוסף, שהתבסס על עשרים ראיונות חצי-מובנים עם גננות ערביות-בדואיות בגני חובה וטרום חובה, בחן את התקשורת בין הגננות להורים ומצא שהוואטסאפ הפך לאמצעי המרכזי לקיום הקשר החינוכי עם המשפחות (Elkashalla et al., 2026). שני המחקרים יחד מלמדים שבחברה הבדואית ערוץ הקשר עצמו הוא סוגיה מחקרית, ולא רק תוכנו.</w:t>
+      </w:r>
+    </w:p>
+    <w:p>
+      <w:pPr>
+        <w:bidi w:val="1"/>
+        <w:jc w:val="both"/>
+      </w:pPr>
+      <w:r>
+        <w:rPr>
+          <w:cs/>
+        </w:rPr>
         <w:t>בחינה של מעורבות הורים בגני ילדים מנקודת מבט תרבותית-חברתית מאפשרת להבין את הקשר בין מעורבות ההורים לבין טיב הקשר עם הגננת, ואת הגורמים הקשורים לנכונותה לאפשר מעורבות זו (בנג'ו ובדיר, 2024). חשיבה מערכתית-אקולוגית מציבה את ההורה ואת תפקידיו במרכז, בו-זמנית עם צורכי הילד, ומחייבת היערכות חברתית הנשענת על תובנות פסיכולוגיות, ללא שיפוטיות ומתוך הבנת האופי המיוחד של המשימה. לנוכח חשיבות השותפות עם ההורים בגיל הרך, רצוי שבכל מסגרת חינוך תנוסח אמנה של שיתוף ויתקיימו סדנאות למחנכים ולהורים המעודדות התייחסות רפלקטיבית לשותפות ביניהם (ארז, 2011).</w:t>
       </w:r>
     </w:p>
@@ -925,7 +961,7 @@
         <w:rPr>
           <w:cs/>
         </w:rPr>
-        <w:t>במחקר השתתפו שלוש אימהות לילדים בגיל הגן מהחברה הבדואית בנגב. המשתתפות נבדלות זו מזו הן בסוג היישוב שהן מתגוררות בו והן במבנה המשפחתי, ושוני זה מאפשר מבט על תנאי חיים מגוונים בתוך אותה חברה. שמות המשתתפות וילדיהן המופיעים בעבודה הם שמות בדויים.</w:t>
+        <w:t>במחקר השתתפו שלוש אימהות לילדים בגיל הגן מהחברה הבדואית בנגב. המשתתפות נבדלות זו מזו בסוג היישוב ובמבנה המשפחתי, ושוני זה מאפשר מבט על תנאי חיים מגוונים בתוך אותה חברה. שמות המשתתפות וילדיהן המופיעים בעבודה הם שמות בדויים.</w:t>
       </w:r>
     </w:p>
     <w:tbl>
@@ -2098,7 +2134,7 @@
         <w:rPr>
           <w:cs/>
         </w:rPr>
-        <w:t>במחקר זה הקפדנו על כמה עקרונות אתיים. הסכמה מדעת: כל המשתתפות חתמו על טופס הסכמה לאחר שקיבלו הסבר על מטרות המחקר ועל זכותן להפסיק את הריאיון בכל שלב. שמירה על פרטיות: שמות המשתתפות, שמות ילדיהן ושמות הגנים שונו כדי לשמור על אנונימיות, ופרטים מזהים הושמטו מהתמלולים. כבוד למשתתפות: הראיונות נערכו בשפתן של המשתתפות, בזמן ובמקום שבחרו, מתוך התחשבות ברגשותיהן, באמונותיהן ובתרבותן. שתיים מהמשתתפות שיתפו מידע אישי על מצבן המשפחתי. מידע זה נכלל בעבודה רק במידה שהוא נדרש להבנת הממצאים, ובניסוח המצמצם ככל האפשר את הפרטים המזהים.</w:t>
+        <w:t>במחקר זה נשמרו כמה עקרונות אתיים. הסכמה מדעת: כל המשתתפות חתמו על טופס הסכמה לאחר שקיבלו הסבר על מטרות המחקר ועל זכותן להפסיק את הריאיון בכל שלב. שמירה על פרטיות: שמות המשתתפות, שמות ילדיהן ושמות הגנים שונו כדי לשמור על אנונימיות, ופרטים מזהים הושמטו מהתמלולים. כבוד למשתתפות: הראיונות נערכו בשפתן של המשתתפות, בזמן ובמקום שבחרו, מתוך התחשבות ברגשותיהן, באמונותיהן ובתרבותן. שתיים מהמשתתפות שיתפו מידע אישי על מצבן המשפחתי. מידע זה נכלל בעבודה רק במידה שהוא נדרש להבנת הממצאים, ובניסוח המצמצם ככל האפשר את הפרטים המזהים.</w:t>
       </w:r>
     </w:p>
     <w:p>
@@ -2178,7 +2214,280 @@
         <w:rPr>
           <w:cs/>
         </w:rPr>
-        <w:t>אימאן תיארה את הוואטסאפ כערוץ שדרכו מגיע המידע על תוכניות הגן ועל הפעילויות:</w:t>
+        <w:t>אימאן תיארה את הוואטסאפ כערוץ שדרכו מגיע המידע על תוכניות הגן ועל הפעילויות: "היא תמיד משתפת אותנו בוואטסאפ בקבוצת האימהות. תמיד משתפת, אומרת: אנחנו נעשה השבוע כך, יהיה לנו כך". היא פירטה גם את התוכן שמועבר בערוץ הזה: "לפעמים היא גם אומרת: נעשה פעילויות כך וכך, והילדים יביאו איתם כך. פעילות על עונת פירות ההדר, אז הם יודעים מה להביא איתם".</w:t>
+      </w:r>
+    </w:p>
+    <w:p>
+      <w:pPr>
+        <w:bidi w:val="1"/>
+        <w:jc w:val="both"/>
+      </w:pPr>
+      <w:r>
+        <w:rPr>
+          <w:cs/>
+        </w:rPr>
+        <w:t>אם יוסף תיארה את אותו דפוס בניסוח חד יותר, המדגיש שמדובר כמעט בערוץ יחיד: "רוב המידע היה מגיע רק בקבוצת וואטסאפ, כלומר נדיר מאוד שעשינו מפגשים בכיתה. אני לא רואה שהדבר הזה נפוץ".</w:t>
+      </w:r>
+    </w:p>
+    <w:p>
+      <w:pPr>
+        <w:pStyle w:val="Heading3"/>
+        <w:bidi w:val="1"/>
+        <w:jc w:val="right"/>
+      </w:pPr>
+      <w:r>
+        <w:rPr>
+          <w:cs/>
+        </w:rPr>
+        <w:t>ב. מיעוט המפגשים פנים אל פנים</w:t>
+      </w:r>
+    </w:p>
+    <w:p>
+      <w:pPr>
+        <w:bidi w:val="1"/>
+        <w:jc w:val="both"/>
+      </w:pPr>
+      <w:r>
+        <w:rPr>
+          <w:cs/>
+        </w:rPr>
+        <w:t>אימאן תיארה מספר מצומצם של שיחות אישיות עם הגננת מתחילת השנה, והסבירה זאת בתנאי החיים שלה: "דיברתי איתה אישית אולי פעמיים שלוש. רוב הזמן אני באה ולוקחת את הילד ומיד מהעבודה, כי אני חוזרת מהעבודה ישר הביתה, כלומר אני לא יושבת בגן". גם תדירות השיתוף בוואטסאפ, לדבריה, אינה יומית: "היא משתפת פעמיים שלוש בשבוע. כל שבוע היא משתפת, אבל לא יום יום".</w:t>
+      </w:r>
+    </w:p>
+    <w:p>
+      <w:pPr>
+        <w:bidi w:val="1"/>
+        <w:jc w:val="both"/>
+      </w:pPr>
+      <w:r>
+        <w:rPr>
+          <w:b/>
+          <w:cs/>
+        </w:rPr>
+        <w:t>סיכום הקטגוריה.</w:t>
+      </w:r>
+      <w:r>
+        <w:rPr>
+          <w:cs/>
+        </w:rPr>
+        <w:t xml:space="preserve"> האימהות מתארות תקשורת שרובה דיגיטלית וקבוצתית, ושמעבירה מידע על הגן כמסגרת: תוכניות, פעילויות ובקשות להביא חומרים. המפגש הישיר, לעומת זאת, הוא אירוע נדיר, ושתי המשתתפות מציינות זאת במפורש. מבחינת שאלת המחקר, הממצא מלמד שהערוץ שדרכו מתקיים הקשר בין ההורה לגננת בגנים שנחקרו הוא ערוץ קבוצתי במהותו, ולכן אינו מיועד מלכתחילה למידע על הילד הפרטי. נקודה זו חוזרת ומתחדדת בקטגוריה הרביעית.</w:t>
+      </w:r>
+    </w:p>
+    <w:p>
+      <w:pPr>
+        <w:pStyle w:val="Heading2"/>
+        <w:bidi w:val="1"/>
+        <w:jc w:val="right"/>
+      </w:pPr>
+      <w:r>
+        <w:rPr>
+          <w:cs/>
+        </w:rPr>
+        <w:t>קטגוריה 2: זמינות הגננת ואמון האם</w:t>
+      </w:r>
+    </w:p>
+    <w:p>
+      <w:pPr>
+        <w:bidi w:val="1"/>
+        <w:jc w:val="both"/>
+      </w:pPr>
+      <w:r>
+        <w:rPr>
+          <w:cs/>
+        </w:rPr>
+        <w:t>קטגוריה זו עוסקת בשאלה אם האם חשה שהגננת זמינה לה ומקשיבה לחששותיה. הממצא הבולט הוא ששתיים מהמשתתפות תיארו גננת זמינה ומגיבה, ואף הצדיקו את גבולות זמינותה, ואילו משתתפת אחת הגדירה את הקשר כלא טוב.</w:t>
+      </w:r>
+    </w:p>
+    <w:p>
+      <w:pPr>
+        <w:pStyle w:val="Heading3"/>
+        <w:bidi w:val="1"/>
+        <w:jc w:val="right"/>
+      </w:pPr>
+      <w:r>
+        <w:rPr>
+          <w:cs/>
+        </w:rPr>
+        <w:t>א. גננת זמינה ומגיבה</w:t>
+      </w:r>
+    </w:p>
+    <w:p>
+      <w:pPr>
+        <w:bidi w:val="1"/>
+        <w:jc w:val="both"/>
+      </w:pPr>
+      <w:r>
+        <w:rPr>
+          <w:cs/>
+        </w:rPr>
+        <w:t>אימאן תיארה היענות עקבית, כולל בשעות הערב: "היא תמיד עונה. אפילו לפעמים אני כותבת לה בלילה כך וכך, ובאמת היא עונה תמיד. וכשאני מתקשרת אליה, אולי רק פעמיים לא ענתה לי, וזה כשהתקשרתי בלילה". היא תיארה גם נכונות לשיחה פנים אל פנים כשהגיעה לגן: "בפעמיים שדיברתי איתה כשהלכתי לגן, היא הייתה, ברוך השם, מדברת, וגם אמרה לי בואי שבי נדבר עוד. אבל אני לא ישבתי הרבה כי חזרתי מהעבודה. לא, הרגשתי שהיא נותנת מקום שנשב ונדבר, היא לא אומרת לנו אני ממהרת, לכי".</w:t>
+      </w:r>
+    </w:p>
+    <w:p>
+      <w:pPr>
+        <w:bidi w:val="1"/>
+        <w:jc w:val="both"/>
+      </w:pPr>
+      <w:r>
+        <w:rPr>
+          <w:cs/>
+        </w:rPr>
+        <w:t>אם יוסף תיארה גננת שיוזמת מסירת מידע גם בלי שנשאלה: "להיפך, היא הייתה עונה, היא הייתה טובה מאוד ומעבירה מידע. לפעמים אפילו לא הייתי שואלת, הייתי שואלת על התלמיד, והיא הייתה אומרת לי ביום החג צילמתי כך וכך וכך".</w:t>
+      </w:r>
+    </w:p>
+    <w:p>
+      <w:pPr>
+        <w:pStyle w:val="Heading3"/>
+        <w:bidi w:val="1"/>
+        <w:jc w:val="right"/>
+      </w:pPr>
+      <w:r>
+        <w:rPr>
+          <w:cs/>
+        </w:rPr>
+        <w:t>ב. גבולות הזמינות ולגיטימציה שהאימהות מעניקות להם</w:t>
+      </w:r>
+    </w:p>
+    <w:p>
+      <w:pPr>
+        <w:bidi w:val="1"/>
+        <w:jc w:val="both"/>
+      </w:pPr>
+      <w:r>
+        <w:rPr>
+          <w:cs/>
+        </w:rPr>
+        <w:t>אם יוסף תיארה תקשורת מוגבלת בשעות, אך נימקה את המגבלה מנקודת מבטה של הגננת: "היה מוגבל, כלומר בערך אחרי השעה שלוש או ארבע הגננת הפסיקה לענות. ואני מבינה את זה, גם לה יש את החיים הפרטיים שלה, והיא לא תמיד פנויה להורים".</w:t>
+      </w:r>
+    </w:p>
+    <w:p>
+      <w:pPr>
+        <w:bidi w:val="1"/>
+        <w:jc w:val="both"/>
+      </w:pPr>
+      <w:r>
+        <w:rPr>
+          <w:cs/>
+        </w:rPr>
+        <w:t>היא הסבירה את הירידה באיכות התקשורת באמצע השנה בעומס המוטל על הגננת: "בהתחלה התקשורת הייתה טובה, אבל באמצע השנה, את יודעת, יש יותר לחץ על הגננת. אבל אני הבנתי אותה, כי יש לה שלושים תלמידים ושלושים אימהות, ולכל אם יש בעיה, אז התקשורת לא הייתה קלה". הסבר דומה ניתן על ידה גם לתדירות הנמוכה של הזמנות להורים: "אני זוכרת אולי פעמיים במהלך השנה, ואני מבינה, אנחנו בערך שלושים תלמידים, ולכל אחד יש אב או אם, אז דברים כאלה קשה מאוד לארגן".</w:t>
+      </w:r>
+    </w:p>
+    <w:p>
+      <w:pPr>
+        <w:bidi w:val="1"/>
+        <w:jc w:val="both"/>
+      </w:pPr>
+      <w:r>
+        <w:rPr>
+          <w:cs/>
+        </w:rPr>
+        <w:t>כשנשאלה אם יש דברים שהייתה רוצה שהגננת תשנה בתקשורת, השיבה: "בכנות לא, אני מרגישה שהמצב היה טוב ביני לבינה".</w:t>
+      </w:r>
+    </w:p>
+    <w:p>
+      <w:pPr>
+        <w:pStyle w:val="Heading3"/>
+        <w:bidi w:val="1"/>
+        <w:jc w:val="right"/>
+      </w:pPr>
+      <w:r>
+        <w:rPr>
+          <w:cs/>
+        </w:rPr>
+        <w:t>ג. קשר שאינו טוב</w:t>
+      </w:r>
+    </w:p>
+    <w:p>
+      <w:pPr>
+        <w:bidi w:val="1"/>
+        <w:jc w:val="both"/>
+      </w:pPr>
+      <w:r>
+        <w:rPr>
+          <w:cs/>
+        </w:rPr>
+        <w:t>אם מוחמד הציגה תמונה שונה מן השתיים האחרות. כשנשאלה כיצד היא מתארת את הקשר שלה עם הגננת השיבה: "בכנות, זו לא מערכת יחסים טובה. הרבה פעמים אני פונה אליה בדברים...".</w:t>
+      </w:r>
+    </w:p>
+    <w:p>
+      <w:pPr>
+        <w:bidi w:val="1"/>
+        <w:jc w:val="both"/>
+      </w:pPr>
+      <w:r>
+        <w:rPr>
+          <w:cs/>
+        </w:rPr>
+        <w:t>בנקודה זו נקטע התיעוד, ולכן לא ניתן לדעת מה היה ההמשך. עם זאת, שני פרטים בדבריה קודם לכן רלוונטיים. ראשית, היא מתארת עצמה כמי שפונה אל הגננת שוב ושוב, כלומר כמי שיוזמת קשר. שנית, בהתרשמותה הכללית מן הגן היא מציינת מחסור בכוח אדם: "טוב, כמו הגנים במגזר הערבי. המורות עובדות עם הילדים, אבל יש מחסור בסייעות".</w:t>
+      </w:r>
+    </w:p>
+    <w:p>
+      <w:pPr>
+        <w:bidi w:val="1"/>
+        <w:jc w:val="both"/>
+      </w:pPr>
+      <w:r>
+        <w:rPr>
+          <w:b/>
+          <w:cs/>
+        </w:rPr>
+        <w:t>סיכום הקטגוריה.</w:t>
+      </w:r>
+      <w:r>
+        <w:rPr>
+          <w:cs/>
+        </w:rPr>
+        <w:t xml:space="preserve"> התמונה שעולה מן הראיונות אינה אחידה. שתי משתתפות תיארו גננת נגישה, שעונה גם בשעות לא שגרתיות ומוסרת מידע ביוזמתה, ושתיהן הביעו הבנה כלפי גבולות הזמינות שלה ותלו אותם בעומס ולא בחוסר רצון. משתתפת שלישית הגדירה את הקשר כלא טוב, אך התיעוד נקטע לפני שפירטה. האימהות שתיארו קשר טוב אינן מתארות אותו כשוויוני אלא כזמין: הן מודות לגננת על כך שהיא עונה, ומצדיקות מראש את הזמנים שבהם אינה עונה. ביחס לשאלת המחקר, נראה שהאמון של האם בגננת נשען פחות על היקף הקשר ויותר על הידיעה שהגננת תענה כאשר יהיה צורך.</w:t>
+      </w:r>
+    </w:p>
+    <w:p>
+      <w:pPr>
+        <w:pStyle w:val="Heading2"/>
+        <w:bidi w:val="1"/>
+        <w:jc w:val="right"/>
+      </w:pPr>
+      <w:r>
+        <w:rPr>
+          <w:cs/>
+        </w:rPr>
+        <w:t>קטגוריה 3: חסמים למעורבות האם</w:t>
+      </w:r>
+    </w:p>
+    <w:p>
+      <w:pPr>
+        <w:bidi w:val="1"/>
+        <w:jc w:val="both"/>
+      </w:pPr>
+      <w:r>
+        <w:rPr>
+          <w:cs/>
+        </w:rPr>
+        <w:t>כל שלוש המשתתפות תיארו רצון בקשר הדוק יותר, לצד חסמים שמנעו זאת. החסמים אינם זהים, והם משקפים את תנאי החיים השונים ביישוב עירוני, ביישוב מוכר ובכפר לא מוכר.</w:t>
+      </w:r>
+    </w:p>
+    <w:p>
+      <w:pPr>
+        <w:pStyle w:val="Heading3"/>
+        <w:bidi w:val="1"/>
+        <w:jc w:val="right"/>
+      </w:pPr>
+      <w:r>
+        <w:rPr>
+          <w:cs/>
+        </w:rPr>
+        <w:t>א. עבודת האם ופער השעות</w:t>
+      </w:r>
+    </w:p>
+    <w:p>
+      <w:pPr>
+        <w:bidi w:val="1"/>
+        <w:jc w:val="both"/>
+      </w:pPr>
+      <w:r>
+        <w:rPr>
+          <w:cs/>
+        </w:rPr>
+        <w:t>אימאן תיארה בדייקנות את פער השעות בין זמינותה שלה לזמינות הגננת:</w:t>
       </w:r>
     </w:p>
     <w:p>
@@ -2191,7 +2500,7 @@
         <w:rPr>
           <w:cs/>
         </w:rPr>
-        <w:t>היא תמיד משתפת אותנו בוואטסאפ בקבוצת האימהות. תמיד משתפת, אומרת: אנחנו נעשה השבוע כך, יהיה לנו כך.</w:t>
+        <w:t>בגלל שאני בעבודה, לא עולה לי בראש להתקשר לגננת בזמן שאני בעבודה. והגננת בוודאי גם היא עובדת עם הילדים, אז היא לא תהיה פנויה לענות. וכשאני חוזרת הביתה עולה לי בראש להתקשר אליה, אבל בלילה או בשעת ערב, וזה זמן לא מתאים.</w:t>
       </w:r>
     </w:p>
     <w:p>
@@ -2203,7 +2512,20 @@
         <w:rPr>
           <w:cs/>
         </w:rPr>
-        <w:t>היא פירטה גם את התוכן שמועבר בערוץ הזה: "לפעמים היא גם אומרת: נעשה פעילויות כך וכך, והילדים יביאו איתם כך. פעילות על עונת פירות ההדר, אז הם יודעים מה להביא איתם".</w:t>
+        <w:t>אותו חסם מנע ממנה להשתתף בפעילות שאליה הוזמנה: "היא אמרה פעם אחת: בואו נשתף, יום להורים בגן. אבל אני באותו זמן לא הייתי פנויה, הייתי בעבודה ולא יכולתי לבוא. בעזרת השם בפעם הבאה אבוא".</w:t>
+      </w:r>
+    </w:p>
+    <w:p>
+      <w:pPr>
+        <w:pStyle w:val="Heading3"/>
+        <w:bidi w:val="1"/>
+        <w:jc w:val="right"/>
+      </w:pPr>
+      <w:r>
+        <w:rPr>
+          <w:cs/>
+        </w:rPr>
+        <w:t>ב. מרחק, הסעה ותשתיות</w:t>
       </w:r>
     </w:p>
     <w:p>
@@ -2215,7 +2537,291 @@
         <w:rPr>
           <w:cs/>
         </w:rPr>
-        <w:t>אם יוסף תיארה את אותו דפוס בניסוח חד יותר, המדגיש שמדובר כמעט בערוץ יחיד:</w:t>
+        <w:t>אם יוסף, המתגוררת בכפר לא מוכר, תיארה שני חסמים נפרדים. הראשון הוא המרחק וההגעה לגן: "היו לי קצת קשיים איך להגיע, כי אנחנו לא גרים קרוב". השני, המשמעותי יותר לענייננו, הוא תשתית התקשורת עצמה: "וגם התקשורת הייתה קשה לי בגלל האינטרנט, כלומר לא תמיד היו לי חשמל ואינטרנט".</w:t>
+      </w:r>
+    </w:p>
+    <w:p>
+      <w:pPr>
+        <w:bidi w:val="1"/>
+        <w:jc w:val="both"/>
+      </w:pPr>
+      <w:r>
+        <w:rPr>
+          <w:cs/>
+        </w:rPr>
+        <w:t>חסם זה נוגע ישירות לערוץ הקשר המרכזי שתואר בקטגוריה הראשונה. כאשר כמעט כל המידע עובר בקבוצת וואטסאפ, אם שאין לה חשמל ואינטרנט באופן רציף אינה משתתפת בערוץ הזה במלואו.</w:t>
+      </w:r>
+    </w:p>
+    <w:p>
+      <w:pPr>
+        <w:bidi w:val="1"/>
+        <w:jc w:val="both"/>
+      </w:pPr>
+      <w:r>
+        <w:rPr>
+          <w:cs/>
+        </w:rPr>
+        <w:t>אצל אם מוחמד ההגעה לגן נפתרת באמצעות בני המשפחה: הילדה "הולכת לפעמים עם אחיה, לפעמים מסיעים אותה קרובי משפחה, ולפעמים הולכים ברגל אל הגן". סידור זה פותר את ההסעה אך מייתר את הגעת האם לגן, ובכך מצמצם את ההזדמנויות למפגש יומיומי עם הגננת.</w:t>
+      </w:r>
+    </w:p>
+    <w:p>
+      <w:pPr>
+        <w:pStyle w:val="Heading3"/>
+        <w:bidi w:val="1"/>
+        <w:jc w:val="right"/>
+      </w:pPr>
+      <w:r>
+        <w:rPr>
+          <w:cs/>
+        </w:rPr>
+        <w:t>ג. גודל הגן והמחסור בסייעות</w:t>
+      </w:r>
+    </w:p>
+    <w:p>
+      <w:pPr>
+        <w:bidi w:val="1"/>
+        <w:jc w:val="both"/>
+      </w:pPr>
+      <w:r>
+        <w:rPr>
+          <w:cs/>
+        </w:rPr>
+        <w:t>שתי משתתפות ציינו את מספר הילדים בכיתה כגורם המגביל את הקשר האישי. אם מוחמד ציינה שלושים ילדים בכיתה והוסיפה שקיים מחסור בסייעות. אם יוסף חזרה על אותו נתון וקשרה אותו ישירות לתקשורת: "יש לה שלושים תלמידים ושלושים אימהות, ולכל אם יש בעיה". אימאן העריכה שמספר הילדים בגן עולה על שלושים, ודיווחה על סייעת אחת בלבד: "כשאני באה לקחת את הילד אני רואה שהילדים רבים, אני מרגישה שהם למעלה משלושים, אני לא יודעת, אבל הרבה. ומסייעת ראיתי, אני חושבת שראיתי רק אחת".</w:t>
+      </w:r>
+    </w:p>
+    <w:p>
+      <w:pPr>
+        <w:bidi w:val="1"/>
+        <w:jc w:val="both"/>
+      </w:pPr>
+      <w:r>
+        <w:rPr>
+          <w:b/>
+          <w:cs/>
+        </w:rPr>
+        <w:t>סיכום הקטגוריה.</w:t>
+      </w:r>
+      <w:r>
+        <w:rPr>
+          <w:cs/>
+        </w:rPr>
+        <w:t xml:space="preserve"> האימהות מתארות רצון במעורבות שנתקל בחסמים מבניים: שעות עבודה שאינן חופפות לשעות הגן, מרחק ותשתיות, וכיתה צפופה עם מחסור בכוח אדם. אף אחת מהן לא תלתה את החסם בחוסר רצון של הגננת. משמעות הדבר לשאלת המחקר היא שמערכת היחסים בין ההורים לגננת בחברה הבדואית מוגבלת במידה רבה על ידי תנאים שאינם בשליטת שני הצדדים. מכאן שהאפשרות של הקשר להשפיע על הילד תלויה בכך שערוצי הקשר יותאמו לתנאים אלה.</w:t>
+      </w:r>
+    </w:p>
+    <w:p>
+      <w:pPr>
+        <w:pStyle w:val="Heading2"/>
+        <w:bidi w:val="1"/>
+        <w:jc w:val="right"/>
+      </w:pPr>
+      <w:r>
+        <w:rPr>
+          <w:cs/>
+        </w:rPr>
+        <w:t>קטגוריה 4: המידע שהאימהות מבקשות: מן הגן אל הילד</w:t>
+      </w:r>
+    </w:p>
+    <w:p>
+      <w:pPr>
+        <w:bidi w:val="1"/>
+        <w:jc w:val="both"/>
+      </w:pPr>
+      <w:r>
+        <w:rPr>
+          <w:cs/>
+        </w:rPr>
+        <w:t>כאשר נשאלו איזה מידע הן מבקשות לקבל מהגננת, המשתתפות הבחינו בין מידע על הגן, שאותו הן מקבלות, לבין מידע על ילדן, שחסר להן. שתיהן הציבו את מצבו הרגשי והחברתי של הילד לפני ההיבט הלימודי.</w:t>
+      </w:r>
+    </w:p>
+    <w:p>
+      <w:pPr>
+        <w:bidi w:val="1"/>
+        <w:jc w:val="both"/>
+      </w:pPr>
+      <w:r>
+        <w:rPr>
+          <w:cs/>
+        </w:rPr>
+        <w:t>אם יוסף ניסחה זאת במפורש: "חשוב לי לראות איך הילד שלי מתנהג באופן כללי עם הילדים, איך הוא מתמודד עם עצמו. האם הוא שמח או עצוב. באופן כללי מצבו הנפשי חשוב לי יותר מהכול. וגם הקשרים החברתיים בכיתה".</w:t>
+      </w:r>
+    </w:p>
+    <w:p>
+      <w:pPr>
+        <w:bidi w:val="1"/>
+        <w:jc w:val="both"/>
+      </w:pPr>
+      <w:r>
+        <w:rPr>
+          <w:cs/>
+        </w:rPr>
+        <w:t>אצל אימאן הבקשה נקשרת למצב המשפחתי: "אני רוצה לראות מה מצבו עם שאר הילדים. את יודעת, האב לא נמצא בתמונה, והוא חסר בבית, והדבר הזה משפיע יותר על הילדים שלי. ואני לא רוצה שהילד שלי ירגיש בחסר כשהוא רואה שלשאר הילדים יש אבות". כשנשאלה אם חשוב לה לדעת אם הילד חש בכך בכיתה, הבהירה שמדובר גם ביכולת החברתית: "כלומר אם הוא יודע ליצור קשרים עם הילדים". לצד זאת היא הזכירה את ההיבט הלימודי ואת תחושת האחריות הבלעדית שלה: "וגם איך הוא בגן, כי בעזרת השם כשיסיים את הגן ויתחיל בית ספר שיהיה מוצלח בבית הספר. ואני זו שעוקבת אחריו, אין מי שיעקוב אחריו חוץ ממני".</w:t>
+      </w:r>
+    </w:p>
+    <w:p>
+      <w:pPr>
+        <w:bidi w:val="1"/>
+        <w:jc w:val="both"/>
+      </w:pPr>
+      <w:r>
+        <w:rPr>
+          <w:cs/>
+        </w:rPr>
+        <w:t>תדירות המידע היא הנקודה שבה שתיהן ביקשו שינוי. אימאן, שנשאלה מה הייתה רוצה שהגננת תשנה, השיבה: "כמו שאמרתי לך, היא משתפת אותנו אבל לא יום יום. הייתי מייחלת שתוכל לשתף ולו תמונה ביום. את יודעת, אדם דואג לילד שלו וחושש כשהוא כל היום רחוק ממנו. אז אם תשתף כל יום תמונה, מה הילד עושה".</w:t>
+      </w:r>
+    </w:p>
+    <w:p>
+      <w:pPr>
+        <w:bidi w:val="1"/>
+        <w:jc w:val="both"/>
+      </w:pPr>
+      <w:r>
+        <w:rPr>
+          <w:cs/>
+        </w:rPr>
+        <w:t>אם יוסף תיארה תמונה דומה מזווית אחרת: "בוודאי שלא באופן יומי אני מקבלת את המידע שהילד שלי מצטלם בו בכיתה, אבל כשהיא משתפת, היא משתפת באופן מספיק". כלומר, השיתוף עצמו נתפס כמספק כשהוא מתרחש, והבעיה היא בתדירותו.</w:t>
+      </w:r>
+    </w:p>
+    <w:p>
+      <w:pPr>
+        <w:bidi w:val="1"/>
+        <w:jc w:val="both"/>
+      </w:pPr>
+      <w:r>
+        <w:rPr>
+          <w:b/>
+          <w:cs/>
+        </w:rPr>
+        <w:t>סיכום הקטגוריה.</w:t>
+      </w:r>
+      <w:r>
+        <w:rPr>
+          <w:cs/>
+        </w:rPr>
+        <w:t xml:space="preserve"> האימהות אינן מתלוננות על מחסור כללי במידע אלא על סוגו ועל תדירותו. הן מקבלות תיעוד של הגן כקבוצה ומבקשות ידיעה על ילדן כפרט, ובעיקר על מצבו הרגשי והחברתי. הבקשה המעשית שעלתה מן הראיונות היא מינימלית מבחינת המשאב הנדרש: תמונה אחת ביום. העובדה ששתי אימהות מיישובים שונים העלו את אותה בקשה, ושקדמו לה שאלות על מצבו הנפשי והחברתי של הילד ולא על הישגיו, מלמדת שמנקודת מבטן הקשר עם הגננת אמור לשרת קודם כול את הצורך לדעת שהילד בסדר.</w:t>
+      </w:r>
+    </w:p>
+    <w:p>
+      <w:pPr>
+        <w:pStyle w:val="Heading2"/>
+        <w:bidi w:val="1"/>
+        <w:jc w:val="right"/>
+      </w:pPr>
+      <w:r>
+        <w:rPr>
+          <w:cs/>
+        </w:rPr>
+        <w:t>קטגוריה 5: השפעת הקשר על תחושת הביטחון והשייכות של הילד</w:t>
+      </w:r>
+    </w:p>
+    <w:p>
+      <w:pPr>
+        <w:bidi w:val="1"/>
+        <w:jc w:val="both"/>
+      </w:pPr>
+      <w:r>
+        <w:rPr>
+          <w:cs/>
+        </w:rPr>
+        <w:t>קטגוריה זו נוגעת ישירות לשאלת המחקר. מדברי המשתתפות עולים שלושה היבטים: הרף הבסיסי של ביטחון הילד בגן, תרומת נוכחות ההורה לתחושת הביטחון של הילד, והגן כמרחב שמשלים את מה שחסר בבית.</w:t>
+      </w:r>
+    </w:p>
+    <w:p>
+      <w:pPr>
+        <w:pStyle w:val="Heading3"/>
+        <w:bidi w:val="1"/>
+        <w:jc w:val="right"/>
+      </w:pPr>
+      <w:r>
+        <w:rPr>
+          <w:cs/>
+        </w:rPr>
+        <w:t>א. הילד בטוח בגן: הרף הבסיסי</w:t>
+      </w:r>
+    </w:p>
+    <w:p>
+      <w:pPr>
+        <w:bidi w:val="1"/>
+        <w:jc w:val="both"/>
+      </w:pPr>
+      <w:r>
+        <w:rPr>
+          <w:cs/>
+        </w:rPr>
+        <w:t>כאשר נשאלו אם ילדיהן חשים בטוחים ושמחים בגן, שתי משתתפות השיבו בחיוב, ושתיהן הגדירו את הביטחון דרך היעדר פגיעה. אם מוחמד אמרה על בתה: "כן, שמחה. אף אחד לא פוגע בה, אף אחד לא מכה. שמחה".</w:t>
+      </w:r>
+    </w:p>
+    <w:p>
+      <w:pPr>
+        <w:bidi w:val="1"/>
+        <w:jc w:val="both"/>
+      </w:pPr>
+      <w:r>
+        <w:rPr>
+          <w:cs/>
+        </w:rPr>
+        <w:t>אימאן תיארה את הביטחון דרך ההתנהגות היומיומית של הילד: "אני מרגישה שהילד שלי שמח בו, הוא הולך שמח, לא בוכה. כשהתחיל את הגן הוא בכה בימים הראשונים, ואחר כך הוא הולך שמח. בבוקר הוא לא מתווכח איתי, ברגע שהוא מתעורר הוא הולך לגן והוא שמח".</w:t>
+      </w:r>
+    </w:p>
+    <w:p>
+      <w:pPr>
+        <w:pStyle w:val="Heading3"/>
+        <w:bidi w:val="1"/>
+        <w:jc w:val="right"/>
+      </w:pPr>
+      <w:r>
+        <w:rPr>
+          <w:cs/>
+        </w:rPr>
+        <w:t>ב. נוכחות ההורה כמקור לביטחון ולשייכות</w:t>
+      </w:r>
+    </w:p>
+    <w:p>
+      <w:pPr>
+        <w:bidi w:val="1"/>
+        <w:jc w:val="both"/>
+      </w:pPr>
+      <w:r>
+        <w:rPr>
+          <w:cs/>
+        </w:rPr>
+        <w:t>אם יוסף קשרה במפורש בין נוכחות בני המשפחה בגן לבין תחושת הביטחון של הילד. כשנשאלה על יתרונות מעורבות ההורים השיבה: "אני מרגישה שזה נותן לתלמיד, כשהוא רואה בני משפחה שלו, שתהיה המשפחה איתו, אז הוא מרגיש יותר, מרגיש בביטחון, כלומר כאילו הוא נמצא עם המשפחה שלו ועם הגננת".</w:t>
+      </w:r>
+    </w:p>
+    <w:p>
+      <w:pPr>
+        <w:bidi w:val="1"/>
+        <w:jc w:val="both"/>
+      </w:pPr>
+      <w:r>
+        <w:rPr>
+          <w:cs/>
+        </w:rPr>
+        <w:t>בדבריה, הביטחון נובע מכך שהגבול בין המשפחה לבין הגן נעשה פחות חד: הילד נמצא בו-זמנית עם משפחתו ועם הגננת. אם יוסף אף ניסחה זאת ברמה העקרונית בהמלצתה לגננת, כשאמרה שעל הגננת לשוחח עם ההורים מכיוון ש"הכיתה היא חלק מחיי ההורים, כי הילדים שלהם בה".</w:t>
+      </w:r>
+    </w:p>
+    <w:p>
+      <w:pPr>
+        <w:pStyle w:val="Heading3"/>
+        <w:bidi w:val="1"/>
+        <w:jc w:val="right"/>
+      </w:pPr>
+      <w:r>
+        <w:rPr>
+          <w:cs/>
+        </w:rPr>
+        <w:t>ג. הגן כמרחב שמשלים את הבית</w:t>
+      </w:r>
+    </w:p>
+    <w:p>
+      <w:pPr>
+        <w:bidi w:val="1"/>
+        <w:jc w:val="both"/>
+      </w:pPr>
+      <w:r>
+        <w:rPr>
+          <w:cs/>
+        </w:rPr>
+        <w:t>אימאן תיארה את מעורבות ההורים כהזדמנות ליחסים שלא מתקיימים בבית:</w:t>
       </w:r>
     </w:p>
     <w:p>
@@ -2228,7 +2834,106 @@
         <w:rPr>
           <w:cs/>
         </w:rPr>
-        <w:t>רוב המידע היה מגיע רק בקבוצת וואטסאפ, כלומר נדיר מאוד שעשינו מפגשים בכיתה. אני לא רואה שהדבר הזה נפוץ.</w:t>
+        <w:t>הילדים יושבים בערך שמונה שעות כל יום בגן, רחוק מההורים. אז כשאנחנו באים ומשתתפים איתם, כי הגננת נותנת לנו מקום ועושה לנו פעילויות, זה יכול לחזק את הקשר שלנו עם הילדים. כי בבית אין לנו את הפעילויות, שם אנחנו עושים פעילויות.</w:t>
+      </w:r>
+    </w:p>
+    <w:p>
+      <w:pPr>
+        <w:bidi w:val="1"/>
+        <w:jc w:val="both"/>
+      </w:pPr>
+      <w:r>
+        <w:rPr>
+          <w:cs/>
+        </w:rPr>
+        <w:t>המשתתפות תיארו גם את הצד ההפוך, שבו הקשר עם הגננת אינו מספק להן את מה שהילד עצמו אינו מוסר. הילד כמקור מידע נמצא מוגבל: אם מוחמד אמרה על בתה "לא תמיד, לפעמים היא מספרת לי מה קרה איתה", ואם יוסף תיארה זאת ביתר חריפות: "בהתחלה היה קשה מאוד, מאוד מאוד. הוא היה אומר שיחק, שיחק, שיחק בלבד, לא נתן לי פירוט ומידע על הגן". אימאן דיווחה על שיתוף רחב יותר מצד הילד, אך תחום בזמן ובמקום: "כשאני חוזרת מהגן, ברכב בדרך, אני שואלת אותו: מה עשית היום בגן? הוא משתף אותי, אומר לי: הגננת סיפרה לנו סיפור כך, הגננת שיחקה איתנו כך. אבל רק למרחק הדרך מהגן לבית, עד שנגיע הביתה".</w:t>
+      </w:r>
+    </w:p>
+    <w:p>
+      <w:pPr>
+        <w:bidi w:val="1"/>
+        <w:jc w:val="both"/>
+      </w:pPr>
+      <w:r>
+        <w:rPr>
+          <w:b/>
+          <w:cs/>
+        </w:rPr>
+        <w:t>סיכום הקטגוריה.</w:t>
+      </w:r>
+      <w:r>
+        <w:rPr>
+          <w:cs/>
+        </w:rPr>
+        <w:t xml:space="preserve"> מדברי המשתתפות עולה שתחושת הביטחון של הילד בגן נמדדת אצלן תחילה ברף בסיסי, היעדר פגיעה והיעדר בכי, ושלושת הילדים עומדים ברף זה. מעבר לרף הזה, האימהות מייחסות את חיזוק תחושת הביטחון והשייכות דווקא למפגש בין המשפחה לגן: כשהילד רואה את בני משפחתו בגן, הוא חש שהוא נמצא עם משפחתו ועם הגננת בעת ובעונה אחת. מנגד, מכיוון שהילד עצמו מוסר מידע חלקי בלבד, האם תלויה בגננת כדי לדעת אם הילד בסדר גם מעבר לרף הבסיסי. כאן נסגר המעגל עם הקטגוריות הקודמות: כאשר הערוץ קבוצתי ותדירותו נמוכה, האם נותרת עם מידע על הגן ובלי מידע על ילדה, וזהו בדיוק המידע שהיא מתארת כחשוב לה יותר מכול.</w:t>
+      </w:r>
+    </w:p>
+    <w:p>
+      <w:pPr>
+        <w:pStyle w:val="Heading2"/>
+        <w:bidi w:val="1"/>
+        <w:jc w:val="right"/>
+      </w:pPr>
+      <w:r>
+        <w:rPr>
+          <w:cs/>
+        </w:rPr>
+        <w:t>סיכום הממצאים</w:t>
+      </w:r>
+    </w:p>
+    <w:p>
+      <w:pPr>
+        <w:bidi w:val="1"/>
+        <w:jc w:val="both"/>
+      </w:pPr>
+      <w:r>
+        <w:rPr>
+          <w:cs/>
+        </w:rPr>
+        <w:t>חמש הקטגוריות מצטרפות לתמונה אחת. שלוש האימהות מייחסות חשיבות רבה לקשר עם הגננת, אך הקשר בפועל מתווך על ידי תנאי החיים שלהן: שעות עבודה, מרחק ותשתיות, וגן צפוף. שתיים מהן תיארו גננת זמינה ומגיבה, ואף הצדיקו את גבולות זמינותה בעומס המוטל עליה, ואילו השלישית הגדירה את הקשר כלא טוב, אם כי התיעוד נקטע לפני שפירטה. הערוץ המרכזי בשני הגנים שתוארו בפירוט הוא קבוצת וואטסאפ, המעבירה מידע על הגן כמסגרת ולא על הילד כפרט. המידע שהאימהות מבקשות הוא בראש ובראשונה רגשי וחברתי, והבקשה המעשית החוזרת היא לתמונה או לעדכון יומי. ולבסוף, האימהות קושרות את תחושת הביטחון והשייכות של הילד למפגש בין המשפחה לגן, ורואות במעורבותן בגן הזדמנות לחזק את הקשר עם ילדיהן, הזדמנות שתנאי חייהן מקשים עליהן לממש.</w:t>
+      </w:r>
+    </w:p>
+    <w:p>
+      <w:r>
+        <w:br w:type="page"/>
+      </w:r>
+    </w:p>
+    <w:p>
+      <w:pPr>
+        <w:pStyle w:val="Heading1"/>
+        <w:bidi w:val="1"/>
+        <w:jc w:val="right"/>
+      </w:pPr>
+      <w:r>
+        <w:rPr>
+          <w:cs/>
+        </w:rPr>
+        <w:t>פרק רביעי: דיון ורפלקציה</w:t>
+      </w:r>
+    </w:p>
+    <w:p>
+      <w:pPr>
+        <w:pStyle w:val="Heading2"/>
+        <w:bidi w:val="1"/>
+        <w:jc w:val="right"/>
+      </w:pPr>
+      <w:r>
+        <w:rPr>
+          <w:cs/>
+        </w:rPr>
+        <w:t>דיון</w:t>
+      </w:r>
+    </w:p>
+    <w:p>
+      <w:pPr>
+        <w:bidi w:val="1"/>
+        <w:jc w:val="both"/>
+      </w:pPr>
+      <w:r>
+        <w:rPr>
+          <w:cs/>
+        </w:rPr>
+        <w:t>מטרת המחקר הייתה לבחון כיצד משפיעה מערכת היחסים בין הורים לגננות על תחושת הביטחון והשייכות של ילדיהם בחברה הבדואית בישראל. שלוש אימהות מסוגי יישוב שונים בנגב רואיינו, וניתוח התוכן העלה חמש קטגוריות: ערוצי התקשורת ותדירותם, זמינות הגננת ואמון האם, חסמים למעורבות האם, המידע שהאימהות מבקשות, והשפעת הקשר על תחושת הביטחון והשייכות של הילד. פרק זה דן בממצאים לאור הספרות שנסקרה בפרק הראשון, מציע תשובה לשאלת המחקר, מציין את מגבלות המחקר ומציע המלצות יישומיות.</w:t>
       </w:r>
     </w:p>
     <w:p>
@@ -2241,7 +2946,7 @@
         <w:rPr>
           <w:cs/>
         </w:rPr>
-        <w:t>ב. מיעוט המפגשים פנים אל פנים</w:t>
+        <w:t>ערוץ קבוצתי במקום דיאלוג</w:t>
       </w:r>
     </w:p>
     <w:p>
@@ -2253,7 +2958,7 @@
         <w:rPr>
           <w:cs/>
         </w:rPr>
-        <w:t>אימאן תיארה מספר מצומצם של שיחות אישיות עם הגננת מתחילת השנה, והסבירה זאת בתנאי החיים שלה: "דיברתי איתה אישית אולי פעמיים שלוש. רוב הזמן אני באה ולוקחת את הילד ומיד מהעבודה, כי אני חוזרת מהעבודה ישר הביתה, כלומר אני לא יושבת בגן". גם תדירות השיתוף בוואטסאפ, לדבריה, אינה יומית: "היא משתפת פעמיים שלוש בשבוע. כל שבוע היא משתפת, אבל לא יום יום".</w:t>
+        <w:t>הממצא הראשון הוא שהקשר בין האימהות לגננת מתנהל ברובו בערוץ אחד, קבוצת הוואטסאפ, המעביר מידע על הגן כמסגרת אך לא על הילד כפרט. אם יוסף ניסחה זאת בחדות כשאמרה שרוב המידע הגיע רק בקבוצת הוואטסאפ ושמפגשים בכיתה היו נדירים מאוד. ממצא זה מתיישב עם ההבחנה בספרות בין מודלים של מעורבות הנמצאים על רצף שבין סבילות לפעילות. ערוץ שבו הגננת מפרסמת והורים מקבלים מציב את ההורים קרוב לעמדת "הצופים", שבה קיים גבול מובחן בינם לבין הגננת, והוא רחוק ממודל "הדיאלוג", שהוא תהליך מתמשך של שיח והיוועצות הדדית (אגם-בן-ארצי וגרינבנק, 2020; בנג'ו ובדיר, 2024).</w:t>
       </w:r>
     </w:p>
     <w:p>
@@ -2263,21 +2968,26 @@
       </w:pPr>
       <w:r>
         <w:rPr>
-          <w:b/>
-          <w:cs/>
-        </w:rPr>
-        <w:t>סיכום הקטגוריה.</w:t>
-      </w:r>
-      <w:r>
-        <w:rPr>
-          <w:cs/>
-        </w:rPr>
-        <w:t xml:space="preserve"> האימהות מתארות תקשורת שרובה דיגיטלית וקבוצתית, ושמעבירה מידע על הגן כמסגרת: תוכניות, פעילויות ובקשות להביא חומרים. המפגש הישיר, לעומת זאת, הוא אירוע נדיר, ושתי המשתתפות מציינות זאת במפורש. מבחינת שאלת המחקר, הממצא מלמד שהערוץ שדרכו מתקיים הקשר בין ההורה לגננת בגנים שנחקרו הוא ערוץ קבוצתי במהותו, ולכן אינו מיועד מלכתחילה למידע על הילד הפרטי. נקודה זו חוזרת ומתחדדת בקטגוריה הרביעית.</w:t>
-      </w:r>
-    </w:p>
-    <w:p>
-      <w:pPr>
-        <w:pStyle w:val="Heading2"/>
+          <w:cs/>
+        </w:rPr>
+        <w:t>מרכזיותו של הוואטסאפ בממצאים אינה ייחודית לגנים שנחקרו כאן. מחקר איכותני שבחן את התקשורת בין גננות ערביות-בדואיות לבין הורים מצא אף הוא שהוואטסאפ הפך לאמצעי המרכזי לקיום הקשר עם המשפחות (Elkashalla et al., 2026). ההתאמה בין המחקרים מחזקת את ההנחה שמדובר בדפוס רווח בחינוך הבדואי בנגב ולא במקרה מקומי. הממצאים הנוכחיים מוסיפים לכך הסתייגות. הכלי שהפך למרכזי אינו נגיש באופן שווה לכל האימהות. אם יוסף, המתגוררת בכפר לא מוכר, תיארה שהתקשורת הייתה קשה לה מפני שלא תמיד היו לה חשמל ואינטרנט. כאשר ערוץ אחד נושא כמעט את כל המידע, כל הפסקה בתשתית היא הפסקה בקשר החינוכי.</w:t>
+      </w:r>
+    </w:p>
+    <w:p>
+      <w:pPr>
+        <w:bidi w:val="1"/>
+        <w:jc w:val="both"/>
+      </w:pPr>
+      <w:r>
+        <w:rPr>
+          <w:cs/>
+        </w:rPr>
+        <w:t>הספרות מציינת שתדירות הקשר ואיכות האינטראקציות משפיעות על מידת המעורבות הכוללת (Arnold et al., 2008), ושתיאום והדדיות בין המשפחה לגן יכולים להתקיים בכמה ערוצים במקביל (שופר-אנגלהרד, 2013). הממצאים מראים שבגנים שנחקרו ערוץ אחד מפותח ואילו האחרים כמעט אינם קיימים. אימאן דיווחה על שתיים או שלוש שיחות אישיות בלבד מתחילת השנה, ואם יוסף ציינה שמפגשים בכיתה היו נדירים. בהיעדר ערוץ אישי, המידע על הילד הבודד נותר תלוי במקריות.</w:t>
+      </w:r>
+    </w:p>
+    <w:p>
+      <w:pPr>
+        <w:pStyle w:val="Heading3"/>
         <w:bidi w:val="1"/>
         <w:jc w:val="right"/>
       </w:pPr>
@@ -2285,7 +2995,7 @@
         <w:rPr>
           <w:cs/>
         </w:rPr>
-        <w:t>קטגוריה 2: זמינות הגננת ואמון האם</w:t>
+        <w:t>אמון הנשען על זמינות, ולגיטימציה שהאימהות מעניקות לגבולותיה</w:t>
       </w:r>
     </w:p>
     <w:p>
@@ -2297,7 +3007,43 @@
         <w:rPr>
           <w:cs/>
         </w:rPr>
-        <w:t>קטגוריה זו עוסקת בשאלה אם האם חשה שהגננת זמינה לה ומקשיבה לחששותיה. הממצא הבולט הוא ששתיים מהמשתתפות תיארו גננת זמינה ומגיבה, ואף הצדיקו את גבולות זמינותה, ואילו משתתפת אחת הגדירה את הקשר כלא טוב.</w:t>
+        <w:t>הממצא השני נוגע לאמון. שתיים מהמשתתפות תיארו גננת נגישה ומגיבה. אימאן ציינה שהגננת עונה תמיד, לעיתים אף בשעות הלילה, ואם יוסף תיארה גננת שמסרה לה מידע ביוזמתה בלי שנשאלה. עמדות חיוביות של גננות כלפי הורים אכן מתאפיינות בתקשורת פתוחה שיוצרת אווירה של אמון שבה ההורים חשים רצויים (אגם-בן-ארצי וגרינבנק, 2020), וההצלחה ביצירת קשרים מיטיבים תלויה בראש ובראשונה בתפיסה הערכית והמקצועית של הגננת (שופר-אנגלהרד, 2013).</w:t>
+      </w:r>
+    </w:p>
+    <w:p>
+      <w:pPr>
+        <w:bidi w:val="1"/>
+        <w:jc w:val="both"/>
+      </w:pPr>
+      <w:r>
+        <w:rPr>
+          <w:cs/>
+        </w:rPr>
+        <w:t>מעניין יותר הוא מה שהאימהות עשו עם גבולות הזמינות. אם יוסף ציינה שאחרי השעה שלוש או ארבע הגננת הפסיקה לענות, ומיד הוסיפה שהיא מבינה זאת משום שגם לגננת יש חיים פרטיים. את הירידה באיכות התקשורת באמצע השנה הסבירה בעומס, וציינה ששלושים תלמידים פירושם שלושים אימהות שלכל אחת מהן יש בעיה. גם את מיעוט ההזמנות להורים הסבירה באותו אופן. כלומר, האימהות אינן תובעות זמינות מלאה אלא מכירות במגבלותיה מראש. תפיסה זו מתכתבת עם הממצא שלפיו הורים מהחברה הערבית סבורים כי נכונות הגננת לאפשר את מעורבותם קשורה בגורמים שאינם בשליטתם (בנג'ו ובדיר, 2024), ועם המחקר שמצא כי הדימוי שההורים מייחסים לגננת מורכב, ומשלב הכרה בדרישות המקצוע עם הערכה שאינה אחידה (גילת ואחרים, 2017).</w:t>
+      </w:r>
+    </w:p>
+    <w:p>
+      <w:pPr>
+        <w:bidi w:val="1"/>
+        <w:jc w:val="both"/>
+      </w:pPr>
+      <w:r>
+        <w:rPr>
+          <w:cs/>
+        </w:rPr>
+        <w:t>מחקר שבחן את החינוך בחברה הערבית בישראל דרך תפיסותיהם של הורים מצא שיחסם של אנשי החינוך לילדים, כפי שההורים חווים אותו, ושיתופם של ההורים בקבלת החלטות הנוגעות לילדיהם הם מן הקטגוריות המרכזיות המעצבות את השותפות (Jorban et al., 2024). הממצאים הנוכחיים תואמים זאת: האימהות שיפטו את הגננת לפי מה שחוו, וההערכה החיובית שלהן נשענה על תחושה שהגננת מנסה להגיע אליהן, ולא על היקף המפגשים בפועל.</w:t>
+      </w:r>
+    </w:p>
+    <w:p>
+      <w:pPr>
+        <w:bidi w:val="1"/>
+        <w:jc w:val="both"/>
+      </w:pPr>
+      <w:r>
+        <w:rPr>
+          <w:cs/>
+        </w:rPr>
+        <w:t>מן העבר האחר, אם מוחמד הגדירה את הקשר כלא טוב וציינה שהיא פונה אל הגננת פעמים רבות. התיעוד נקטע לפני שפירטה, ולכן אי אפשר לקבוע מה עמד ביסוד הקושי. עם זאת, הצירוף שהיא מתארת, פנייה חוזרת מצד האם לצד הגדרת הקשר כלא טוב, מצביע על אפשרות שהאם יוזמת ואינה חשה מענה. הספרות מציינת שקשיי תקשורת, נטייה לשיפוטיות וחוסר אמון עלולים לפגוע בתחושת הערך העצמי של ההורה ולהקשות עליו להתגייס לטובת ילדו (אגם-בן-ארצי וגרינבנק, 2020). מחקר שבחן את הקשר בין גננות להורים דרך מושג ההון התרבותי מראה שלקשר יש רובד גלוי ורובד סמוי, ושבשניהם יש רווחים ועלויות לכל צד (נער וביברמן-שלו, 2021). המקרה של אם מוחמד ממחיש שאותו קשר עצמו עשוי להיחוות אחרת לחלוטין על ידי אימהות שונות באותה חברה.</w:t>
       </w:r>
     </w:p>
     <w:p>
@@ -2310,7 +3056,7 @@
         <w:rPr>
           <w:cs/>
         </w:rPr>
-        <w:t>א. גננת זמינה ומגיבה</w:t>
+        <w:t>חסמים מבניים והתאמת הערוץ</w:t>
       </w:r>
     </w:p>
     <w:p>
@@ -2322,20 +3068,19 @@
         <w:rPr>
           <w:cs/>
         </w:rPr>
-        <w:t>אימאן תיארה היענות עקבית, כולל בשעות הערב:</w:t>
-      </w:r>
-    </w:p>
-    <w:p>
-      <w:pPr>
-        <w:bidi w:val="1"/>
-        <w:ind w:right="709" w:left="709"/>
+        <w:t>הממצא השלישי הוא שהחסמים למעורבות האימהות הם מבניים ולא עמדתיים. אימאן תיארה פער שעות מדויק: בזמן שהיא בעבודה לא עולה בדעתה להתקשר, והגננת ממילא עסוקה עם הילדים, וכשהיא חוזרת הביתה הזמן שנותר הוא הערב, שאינו זמן מתאים. אותו חסם מנע ממנה להשתתף ביום ההורים היחיד שאליו הוזמנה. אם יוסף תיארה קושי בהגעה בשל המרחק, ובעיקר את היעדר החשמל והאינטרנט. שלוש המשתתפות ציינו כיתות של כשלושים ילדים, ושתיים מהן קשרו זאת במפורש למחסור בכוח אדם.</w:t>
+      </w:r>
+    </w:p>
+    <w:p>
+      <w:pPr>
+        <w:bidi w:val="1"/>
         <w:jc w:val="both"/>
       </w:pPr>
       <w:r>
         <w:rPr>
           <w:cs/>
         </w:rPr>
-        <w:t>היא תמיד עונה. אפילו לפעמים אני כותבת לה בלילה כך וכך, ובאמת היא עונה תמיד. וכשאני מתקשרת אליה, אולי רק פעמיים לא ענתה לי, וזה כשהתקשרתי בלילה.</w:t>
+        <w:t>לחסמים האלה יש תימוכין ישירים בספרות על החברה הבדואית. מדיניות ממשלתית שהתאפיינה בקיפוח בתחומי החינוך, השיכון והפיתוח המוניציפלי (אבו-סעד, 2023) מגיעה, כפי שמראים הממצאים, עד לשיחה היומיומית בין אם לגננת. מחקר שבחן את יחסי המורים וההורים בחינוך הערבי-הבדואי מצא אף הוא חסמים מבניים ייחודיים לחברה זו, ובהם מחסור בחשמל ובתשתיות ופערים דיגיטליים, במיוחד בכפרים הלא מוכרים (אבו-גוידר, 2025). מחקר נוסף, שנערך בקרב מורים בכפרים הלא-מוכרים בנגב, מתאר כיצד האיסור החוקי על חיבור לתשתיות מים וחשמל מגביל ישירות את סוג הקשר שאפשר לקיים בין הצוות החינוכי למשפחות (Abu-Gweder &amp; Solomovich, 2025). במילים אחרות, מעמד התכנון של היישוב נוכח בתוך הקשר החינוכי עצמו.</w:t>
       </w:r>
     </w:p>
     <w:p>
@@ -2347,7 +3092,7 @@
         <w:rPr>
           <w:cs/>
         </w:rPr>
-        <w:t>היא תיארה גם נכונות לשיחה פנים אל פנים כשהגיעה לגן: "בפעמיים שדיברתי איתה כשהלכתי לגן, היא הייתה, ברוך השם, מדברת, וגם אמרה לי בואי שבי נדבר עוד. אבל אני לא ישבתי הרבה כי חזרתי מהעבודה. לא, הרגשתי שהיא נותנת מקום שנשב ונדבר, היא לא אומרת לנו אני ממהרת, לכי".</w:t>
+        <w:t>הפער בין תרבות הבית לתרבות הפדגוגית של הגן מוסיף רובד לחסמים אלה. מחקר שליווה גננות בכפר בדואי לא מוכר תיאר מתח בין פדגוגיה המעודדת חקר ושאילת שאלות לבין נורמות משפחתיות וקהילתיות המבססות את העברת הידע על התבוננות וחיקוי (אלעטאונה ואבריאל-אבני, 2017). בממצאים הנוכחיים מתח זה אינו עולה במישרין, אך הוא עשוי להסביר מדוע אם יוסף מדדה את איכות הגן בעיקר לפי החומר הלימודי שהועבר, בעוד שאת הציפייה לשיח על הילד עצמו ניסחה רק בהמשך הריאיון וכתשובה לשאלה מפורשת.</w:t>
       </w:r>
     </w:p>
     <w:p>
@@ -2359,20 +3104,19 @@
         <w:rPr>
           <w:cs/>
         </w:rPr>
-        <w:t>אם יוסף תיארה גננת שיוזמת מסירת מידע גם בלי שנשאלה:</w:t>
-      </w:r>
-    </w:p>
-    <w:p>
-      <w:pPr>
-        <w:bidi w:val="1"/>
-        <w:ind w:right="709" w:left="709"/>
+        <w:t>חסם הזמן שתיארה אימאן ראוי לתשומת לב מיוחדת. מחקר שבחן 1,784 הורים לילדי גן מצא שקונפליקט העבודה-משפחה מתווך את הקשר בין איכות היחסים עם הגננת לבין בעיות ההתנהגות של הילד, כך שיחסים טובים עם הגננת מפחיתים את הקונפליקט ומעלים את תחושת המסוגלות ההורית (Liu et al., 2024). הממצאים כאן מצביעים על אותה מערכת בכיוון ההפוך: כאשר ערוצי הקשר אינם מותאמים לשעות העבודה של האם, העבודה אינה נסיבה חיצונית בלבד אלא הופכת לחסם שמונע מהקשר להיווצר מלכתחילה.</w:t>
+      </w:r>
+    </w:p>
+    <w:p>
+      <w:pPr>
+        <w:bidi w:val="1"/>
         <w:jc w:val="both"/>
       </w:pPr>
       <w:r>
         <w:rPr>
           <w:cs/>
         </w:rPr>
-        <w:t>להיפך, היא הייתה עונה, היא הייתה טובה מאוד ומעבירה מידע. לפעמים אפילו לא הייתי שואלת, הייתי שואלת על התלמיד, והיא הייתה אומרת לי ביום החג צילמתי כך וכך וכך.</w:t>
+        <w:t>הספרות מציינת שהורים בעלי הכנסה נמוכה והורים חד-הוריים נוטים להיות פחות מעורבים (ואזן-סיקרון ואחרים, 2014; Arnold et al., 2008). הממצאים מאפשרים לדייק ניסוח זה. שלוש המשתתפות נושאות לבדן באחריות לילדיהן, ואף אחת מהן לא הביעה חוסר עניין. להפך, אימאן ביקשה עדכון יומי, ואם יוסף המליצה על מפגשים חודשיים קבועים. ההבדל בין רצון ליכולת הוא העיקר כאן. ממצא זה מתיישב עם הטענה שכאשר ההורה חש שהגננת עושה מאמץ כן ליצירת קשר, עולה הסבירות שיהיה מעורב, גם כשמדובר בהורים מתרבויות שונות ואף כשלא הייתה להם מוטיבציה ראשונית (שופר-אנגלהרד, 2013), ועם ההדגשה שהתאמה לצורכי אוכלוסיית היעד היא תנאי להצלחתה של כל תוכנית (ואזן-סיקרון ואחרים, 2014).</w:t>
       </w:r>
     </w:p>
     <w:p>
@@ -2385,7 +3129,7 @@
         <w:rPr>
           <w:cs/>
         </w:rPr>
-        <w:t>ב. גבולות הזמינות ולגיטימציה שהאימהות מעניקות להם</w:t>
+        <w:t>המידע המבוקש: רגשי וחברתי לפני לימודי</w:t>
       </w:r>
     </w:p>
     <w:p>
@@ -2397,20 +3141,19 @@
         <w:rPr>
           <w:cs/>
         </w:rPr>
-        <w:t>אם יוסף תיארה תקשורת מוגבלת בשעות, אך נימקה את המגבלה מנקודת מבטה של הגננת:</w:t>
-      </w:r>
-    </w:p>
-    <w:p>
-      <w:pPr>
-        <w:bidi w:val="1"/>
-        <w:ind w:right="709" w:left="709"/>
+        <w:t>הממצא הרביעי הוא שהאימהות ביקשו מהגננת בראש ובראשונה מידע על מצבו הרגשי והחברתי של הילד. אם יוסף אמרה במפורש שמצבו הנפשי של בנה חשוב לה יותר מהכול, ומיד אחריו הזכירה את הקשרים החברתיים בכיתה. אימאן ביקשה לדעת מה מצבו של בנה עם שאר הילדים, וקשרה זאת להיעדרו של האב ולחשש שהילד ירגיש בחסר. רק לאחר מכן הזכירה את ההיבט הלימודי.</w:t>
+      </w:r>
+    </w:p>
+    <w:p>
+      <w:pPr>
+        <w:bidi w:val="1"/>
         <w:jc w:val="both"/>
       </w:pPr>
       <w:r>
         <w:rPr>
           <w:cs/>
         </w:rPr>
-        <w:t>היה מוגבל, כלומר בערך אחרי השעה שלוש או ארבע הגננת הפסיקה לענות. ואני מבינה את זה, גם לה יש את החיים הפרטיים שלה, והיא לא תמיד פנויה להורים.</w:t>
+        <w:t>ממצא זה מתיישב עם התפיסה שלעבודה עם הורים יש השפעה על התפקוד הרגשי-חברתי בגילים המוקדמים במיוחד (ואזן-סיקרון ואחרים, 2014), ועם ההבנה שמערכות יחסים קרובות עם מבוגרים משמעותיים יוצרות את הבסיס הרגשי המאפשר התפתחות תקינה (ארז, 2011). הוא מתכתב במיוחד עם מחקר שבחן את תפיסות ההורים את השותפות עם המוסד החינוכי בדגש על ההיבט הרגשי-חברתי, ומסקנתו שיש לפתח שותפות החורגת מההיבטים המנהליים ומתמקדת במיומנויות הרגשיות-חברתיות של הילד, ושהשותפות אינה בגדר המלצה אלא תנאי (ישראלאשווילי, 2025). האימהות במחקר הנוכחי, בלי להכיר את הספרות, ניסחו בדיוק את אותו סדר עדיפויות.</w:t>
       </w:r>
     </w:p>
     <w:p>
@@ -2422,7 +3165,20 @@
         <w:rPr>
           <w:cs/>
         </w:rPr>
-        <w:t>היא הסבירה את הירידה באיכות התקשורת באמצע השנה בעומס המוטל על הגננת: "בהתחלה התקשורת הייתה טובה, אבל באמצע השנה, את יודעת, יש יותר לחץ על הגננת. אבל אני הבנתי אותה, כי יש לה שלושים תלמידים ושלושים אימהות, ולכל אם יש בעיה, אז התקשורת לא הייתה קלה". הסבר דומה ניתן על ידה גם לתדירות הנמוכה של הזמנות להורים: "אני זוכרת אולי פעמיים במהלך השנה, ואני מבינה, אנחנו בערך שלושים תלמידים, ולכל אחד יש אב או אם, אז דברים כאלה קשה מאוד לארגן".</w:t>
+        <w:t>חשיבותו של המידע הזה מתחדדת לנוכח ממצא נוסף: הילד עצמו אינו מקור מידע מהימן. אם יוסף תיארה שבנה אמר רק "שיחק, שיחק" ולא מסר פרטים, אם מוחמד ציינה שבתה מספרת רק לפעמים, ואימאן תיארה שיתוף התחום למשך הנסיעה מהגן הביתה. כאשר הילד מוסר מעט והערוץ עם הגננת קבוצתי, האם נותרת בלי מידע על ילדה. הבקשה המעשית שעלתה מכאן, תמונה אחת ביום, קטנה במונחי משאבים אך מבטאת מעבר מהודעה על הגן להודעה על הילד.</w:t>
+      </w:r>
+    </w:p>
+    <w:p>
+      <w:pPr>
+        <w:pStyle w:val="Heading3"/>
+        <w:bidi w:val="1"/>
+        <w:jc w:val="right"/>
+      </w:pPr>
+      <w:r>
+        <w:rPr>
+          <w:cs/>
+        </w:rPr>
+        <w:t>תשובה לשאלת המחקר</w:t>
       </w:r>
     </w:p>
     <w:p>
@@ -2434,7 +3190,67 @@
         <w:rPr>
           <w:cs/>
         </w:rPr>
-        <w:t>כששאלנו אותה אם יש דברים שהייתה רוצה שהגננת תשנה בתקשורת, השיבה: "בכנות לא, אני מרגישה שהמצב היה טוב ביני לבינה".</w:t>
+        <w:t>הממצא החמישי מספק את התשובה לשאלת המחקר. מדברי האימהות עולה שמערכת היחסים עם הגננת משפיעה על תחושת הביטחון והשייכות של הילד בשלושה מסלולים.</w:t>
+      </w:r>
+    </w:p>
+    <w:p>
+      <w:pPr>
+        <w:bidi w:val="1"/>
+        <w:jc w:val="both"/>
+      </w:pPr>
+      <w:r>
+        <w:rPr>
+          <w:cs/>
+        </w:rPr>
+        <w:t>במסלול הראשון נמצא רף בסיסי של ביטחון, המוגדר על ידי האימהות כהיעדר פגיעה והיעדר בכי. אם מוחמד אמרה שבתה שמחה ושאיש אינו פוגע בה או מכה אותה, ואימאן תיארה ילד שהולך לגן שמח ואינו בוכה. רף זה נענה בשלושת המקרים, גם באותו מקרה שבו האם הגדירה את הקשר שלה עם הגננת כלא טוב. מכאן שהקשר בין ההורה לגננת אינו התנאי לביטחון הבסיסי של הילד בגן, אלא נוגע לרובד שמעליו.</w:t>
+      </w:r>
+    </w:p>
+    <w:p>
+      <w:pPr>
+        <w:bidi w:val="1"/>
+        <w:jc w:val="both"/>
+      </w:pPr>
+      <w:r>
+        <w:rPr>
+          <w:cs/>
+        </w:rPr>
+        <w:t>במסלול השני, הרובד שמעל הרף הבסיסי הוא תחושת השייכות, והיא נקשרת ישירות למפגש בין המשפחה לגן. אם יוסף ניסחה זאת בבהירות כשאמרה שכאשר הילד רואה את בני משפחתו בגן הוא מרגיש ביטחון רב יותר, כאילו הוא נמצא עם משפחתו ועם הגננת גם יחד. זהו ביטוי מדויק לרעיון ההמשכיות בין הסביבה הביתית לסביבת הגן (אגם-בן-ארצי וגרינבנק, 2020) ולממצא שלפיו הורים מעורבים מסייעים בבניית יחסים חיוביים בין הילדים לגננותיהם ומטפחים רגשות חיוביים כלפי הגן (Arnold et al., 2008). תחושת שייכות למסגרת ותפיסתה כמקום בטוח אף נקשרו בספרות לירידה בבעיות התנהגות (ארז, 2011).</w:t>
+      </w:r>
+    </w:p>
+    <w:p>
+      <w:pPr>
+        <w:bidi w:val="1"/>
+        <w:jc w:val="both"/>
+      </w:pPr>
+      <w:r>
+        <w:rPr>
+          <w:cs/>
+        </w:rPr>
+        <w:t>במסלול השלישי, הקשר עם הגננת משמש את האם ככלי לניטור מצבו של ילדה, ובכך משפיע על תחושת הביטחון שלה עצמה. מכיוון שהילד מוסר מידע חלקי, ומכיוון שהאם שוהה בגן זמן קצר או אינה שוהה בו כלל, הגננת היא המקור היחיד לידיעה אם הילד בסדר. אימאן תיארה את החשש שמתלווה לשהות ממושכת של הילד הרחק מההורה, ואת הבקשה לתמונה יומית כמענה לחשש הזה.</w:t>
+      </w:r>
+    </w:p>
+    <w:p>
+      <w:pPr>
+        <w:bidi w:val="1"/>
+        <w:jc w:val="both"/>
+      </w:pPr>
+      <w:r>
+        <w:rPr>
+          <w:cs/>
+        </w:rPr>
+        <w:t>שלושת המסלולים עולים בקנה אחד עם התפיסה האקולוגית, שלפיה הקשר בין ההורה לגננת אינו נפרד מרשת היחסים של הילד אלא חלק ממנה, וכל היחסים הקרובים בסביבתו קשורים לתוצאות ההתפתחותיות שלו בתחום החברתי ובתחום הלימודי (Weisberger &amp; Ziv, 2023). ההבחנה בין הקשר כפי שההורה חווה אותו לבין הקשר כפי שהגננת חווה אותו, שנמצאה משמעותית במחקר כמותי שכלל 167 גננות ו-1,019 ילדים והוריהם (Cai et al., 2024), מקבלת כאן ביטוי איכותני. המידע שהאימהות מחזיקות על ילדיהן, כמו היעדרו של האב במקרה של אימאן, אינו מגיע בהכרח לגננת, ולכן אינו יכול להיות מתורגם לפעולה בגן.</w:t>
+      </w:r>
+    </w:p>
+    <w:p>
+      <w:pPr>
+        <w:bidi w:val="1"/>
+        <w:jc w:val="both"/>
+      </w:pPr>
+      <w:r>
+        <w:rPr>
+          <w:cs/>
+        </w:rPr>
+        <w:t>התשובה לשאלת המחקר היא אפוא שמערכת היחסים בין ההורים לגננות בחברה הבדואית משפיעה על תחושת הביטחון והשייכות של הילד בעיקר מעל לרף הבסיסי של הביטחון הפיזי: היא מחזקת את תחושת השייכות כאשר היא מביאה את המשפחה אל תוך הגן, והיא מרגיעה את האם ובכך משפיעה בעקיפין על הילד. שני המסלולים תלויים בקיומו של ערוץ אישי בין האם לגננת, ובחברה הבדואית קיומו של ערוץ כזה תלוי במידה רבה בהתאמתו לתנאי החיים של האם: לשעות עבודתה, למרחק מהגן ולזמינות התשתיות ביישובה.</w:t>
       </w:r>
     </w:p>
     <w:p>
@@ -2447,7 +3263,7 @@
         <w:rPr>
           <w:cs/>
         </w:rPr>
-        <w:t>ג. קשר שאינו טוב</w:t>
+        <w:t>מגבלות המחקר</w:t>
       </w:r>
     </w:p>
     <w:p>
@@ -2459,20 +3275,32 @@
         <w:rPr>
           <w:cs/>
         </w:rPr>
-        <w:t>אם מוחמד הציגה תמונה שונה מן השתיים האחרות. כשנשאלה כיצד היא מתארת את הקשר שלה עם הגננת השיבה:</w:t>
-      </w:r>
-    </w:p>
-    <w:p>
-      <w:pPr>
-        <w:bidi w:val="1"/>
-        <w:ind w:right="709" w:left="709"/>
+        <w:t>למחקר כמה מגבלות. ראשית, השתתפו בו שלוש אימהות בלבד, והממצאים אינם ניתנים להכללה על כלל האימהות בחברה הבדואית. שנית, הראיונות היו קצרים, ומגבלה זו צמצמה את היכולת להעמיק בתשובות ולשאול שאלות המשך. שלישית, הריאיון עם אם מוחמד נקטע בדיוק בנקודה החשובה ביותר לענייננו, כשהחלה להסביר מדוע הקשר עם הגננת אינו טוב, ולכן העדות היחידה על קשר בעייתי נותרה חלקית. רביעית, לא נאספו נתוני רקע מלאים מכל המשתתפות, ובכלל זה שנות לימוד ומספר הסייעות בגן, ולכן הטבלה בפרק השיטה חסרה. חמישית, נשמע רק קולן של האימהות. הגננות, שכל המשתתפות תיארו כמי שפועלות בתנאים קשים, לא רואיינו. שישית, הראיונות תורגמו מערבית לעברית, ותרגום עלול לאבד ניואנסים של הניב המדובר. לבסוף, האבות לא רואיינו, אף שבמשפחה הבדואית המסורתית, המתוארת כפטריארכלית והיררכית (יפה וחראנבה, 2019), עמדתם עשויה להשפיע על מידת המעורבות של האם.</w:t>
+      </w:r>
+    </w:p>
+    <w:p>
+      <w:pPr>
+        <w:pStyle w:val="Heading3"/>
+        <w:bidi w:val="1"/>
+        <w:jc w:val="right"/>
+      </w:pPr>
+      <w:r>
+        <w:rPr>
+          <w:cs/>
+        </w:rPr>
+        <w:t>המלצות יישומיות</w:t>
+      </w:r>
+    </w:p>
+    <w:p>
+      <w:pPr>
+        <w:bidi w:val="1"/>
         <w:jc w:val="both"/>
       </w:pPr>
       <w:r>
         <w:rPr>
           <w:cs/>
         </w:rPr>
-        <w:t>בכנות, זו לא מערכת יחסים טובה. הרבה פעמים אני פונה אליה בדברים...</w:t>
+        <w:t>מהממצאים עולות כמה המלצות מעשיות לגננות בגנים בחברה הבדואית ולמערכת המפעילה אותם.</w:t>
       </w:r>
     </w:p>
     <w:p>
@@ -2484,7 +3312,7 @@
         <w:rPr>
           <w:cs/>
         </w:rPr>
-        <w:t>בנקודה זו נקטע התיעוד, ולכן לא ניתן לדעת מה היה ההמשך. עם זאת, שני פרטים בדבריה קודם לכן רלוונטיים. ראשית, היא מתארת עצמה כמי שפונה אל הגננת שוב ושוב, כלומר כמי שיוזמת קשר. שנית, בהתרשמותה הכללית מן הגן היא מציינת מחסור בכוח אדם: "טוב, כמו הגנים במגזר הערבי. המורות עובדות עם הילדים, אבל יש מחסור בסייעות".</w:t>
+        <w:t>1. עדכון אישי קצר וקבוע על כל ילד, ולו משפט אחד או תמונה אחת בשבוע, המתמקד במצבו הרגשי והחברתי ולא בפעילות הגן. זו הבקשה המפורשת שעלתה מהראיונות, והיא ההשקעה הקטנה ביותר שתעביר את הערוץ מרמת הגן לרמת הילד.</w:t>
       </w:r>
     </w:p>
     <w:p>
@@ -2494,29 +3322,9 @@
       </w:pPr>
       <w:r>
         <w:rPr>
-          <w:b/>
-          <w:cs/>
-        </w:rPr>
-        <w:t>סיכום הקטגוריה.</w:t>
-      </w:r>
-      <w:r>
-        <w:rPr>
-          <w:cs/>
-        </w:rPr>
-        <w:t xml:space="preserve"> התמונה שעולה מן הראיונות אינה אחידה. שתי משתתפות תיארו גננת נגישה, שעונה גם בשעות לא שגרתיות ומוסרת מידע ביוזמתה, ושתיהן הביעו הבנה כלפי גבולות הזמינות שלה ותלו אותם בעומס ולא בחוסר רצון. משתתפת שלישית הגדירה את הקשר כלא טוב, אך התיעוד נקטע לפני שפירטה. ראוי לשים לב שהאימהות שתיארו קשר טוב אינן מתארות אותו כשוויוני אלא כזמין: הן מודות לגננת על כך שהיא עונה, ומצדיקות מראש את הזמנים שבהם אינה עונה. ביחס לשאלת המחקר, נראה שהאמון של האם בגננת נשען פחות על היקף הקשר ויותר על הידיעה שהגננת תענה כאשר יהיה צורך.</w:t>
-      </w:r>
-    </w:p>
-    <w:p>
-      <w:pPr>
-        <w:pStyle w:val="Heading2"/>
-        <w:bidi w:val="1"/>
-        <w:jc w:val="right"/>
-      </w:pPr>
-      <w:r>
-        <w:rPr>
-          <w:cs/>
-        </w:rPr>
-        <w:t>קטגוריה 3: חסמים למעורבות האם</w:t>
+          <w:cs/>
+        </w:rPr>
+        <w:t>2. שעת קבלה טלפונית קבועה וידועה מראש, למשל שעה אחת בשבוע, כדי שאימהות עובדות יוכלו לתכנן את הפנייה במקום להתקשר בערב, בזמן שהן עצמן מגדירות כלא מתאים.</w:t>
       </w:r>
     </w:p>
     <w:p>
@@ -2528,946 +3336,7 @@
         <w:rPr>
           <w:cs/>
         </w:rPr>
-        <w:t>כל שלוש המשתתפות תיארו רצון בקשר הדוק יותר, לצד חסמים שמנעו זאת. החסמים אינם זהים, והם משקפים את תנאי החיים השונים ביישוב עירוני, ביישוב מוכר ובכפר לא מוכר.</w:t>
-      </w:r>
-    </w:p>
-    <w:p>
-      <w:pPr>
-        <w:pStyle w:val="Heading3"/>
-        <w:bidi w:val="1"/>
-        <w:jc w:val="right"/>
-      </w:pPr>
-      <w:r>
-        <w:rPr>
-          <w:cs/>
-        </w:rPr>
-        <w:t>א. עבודת האם ופער השעות</w:t>
-      </w:r>
-    </w:p>
-    <w:p>
-      <w:pPr>
-        <w:bidi w:val="1"/>
-        <w:jc w:val="both"/>
-      </w:pPr>
-      <w:r>
-        <w:rPr>
-          <w:cs/>
-        </w:rPr>
-        <w:t>אימאן תיארה בדייקנות את פער השעות בין זמינותה שלה לזמינות הגננת:</w:t>
-      </w:r>
-    </w:p>
-    <w:p>
-      <w:pPr>
-        <w:bidi w:val="1"/>
-        <w:ind w:right="709" w:left="709"/>
-        <w:jc w:val="both"/>
-      </w:pPr>
-      <w:r>
-        <w:rPr>
-          <w:cs/>
-        </w:rPr>
-        <w:t>בגלל שאני בעבודה, לא עולה לי בראש להתקשר לגננת בזמן שאני בעבודה. והגננת בוודאי גם היא עובדת עם הילדים, אז היא לא תהיה פנויה לענות. וכשאני חוזרת הביתה עולה לי בראש להתקשר אליה, אבל בלילה או בשעת ערב, וזה זמן לא מתאים.</w:t>
-      </w:r>
-    </w:p>
-    <w:p>
-      <w:pPr>
-        <w:bidi w:val="1"/>
-        <w:jc w:val="both"/>
-      </w:pPr>
-      <w:r>
-        <w:rPr>
-          <w:cs/>
-        </w:rPr>
-        <w:t>אותו חסם מנע ממנה להשתתף בפעילות שאליה הוזמנה: "היא אמרה פעם אחת: בואו נשתף, יום להורים בגן. אבל אני באותו זמן לא הייתי פנויה, הייתי בעבודה ולא יכולתי לבוא. בעזרת השם בפעם הבאה אבוא".</w:t>
-      </w:r>
-    </w:p>
-    <w:p>
-      <w:pPr>
-        <w:pStyle w:val="Heading3"/>
-        <w:bidi w:val="1"/>
-        <w:jc w:val="right"/>
-      </w:pPr>
-      <w:r>
-        <w:rPr>
-          <w:cs/>
-        </w:rPr>
-        <w:t>ב. מרחק, הסעה ותשתיות</w:t>
-      </w:r>
-    </w:p>
-    <w:p>
-      <w:pPr>
-        <w:bidi w:val="1"/>
-        <w:jc w:val="both"/>
-      </w:pPr>
-      <w:r>
-        <w:rPr>
-          <w:cs/>
-        </w:rPr>
-        <w:t>אם יוסף, המתגוררת בכפר לא מוכר, תיארה שני חסמים נפרדים. הראשון הוא המרחק וההגעה לגן: "היו לי קצת קשיים איך להגיע, כי אנחנו לא גרים קרוב". השני, המשמעותי יותר לענייננו, הוא תשתית התקשורת עצמה:</w:t>
-      </w:r>
-    </w:p>
-    <w:p>
-      <w:pPr>
-        <w:bidi w:val="1"/>
-        <w:ind w:right="709" w:left="709"/>
-        <w:jc w:val="both"/>
-      </w:pPr>
-      <w:r>
-        <w:rPr>
-          <w:cs/>
-        </w:rPr>
-        <w:t>וגם התקשורת הייתה קשה לי בגלל האינטרנט, כלומר לא תמיד היו לי חשמל ואינטרנט.</w:t>
-      </w:r>
-    </w:p>
-    <w:p>
-      <w:pPr>
-        <w:bidi w:val="1"/>
-        <w:jc w:val="both"/>
-      </w:pPr>
-      <w:r>
-        <w:rPr>
-          <w:cs/>
-        </w:rPr>
-        <w:t>חסם זה נוגע ישירות לערוץ הקשר המרכזי שתואר בקטגוריה הראשונה. כאשר כמעט כל המידע עובר בקבוצת וואטסאפ, אם שאין לה חשמל ואינטרנט באופן רציף אינה משתתפת בערוץ הזה במלואו.</w:t>
-      </w:r>
-    </w:p>
-    <w:p>
-      <w:pPr>
-        <w:bidi w:val="1"/>
-        <w:jc w:val="both"/>
-      </w:pPr>
-      <w:r>
-        <w:rPr>
-          <w:cs/>
-        </w:rPr>
-        <w:t>אצל אם מוחמד ההגעה לגן נפתרת באמצעות בני המשפחה: הילדה "הולכת לפעמים עם אחיה, לפעמים מסיעים אותה קרובי משפחה, ולפעמים הולכים ברגל אל הגן". סידור זה פותר את ההסעה אך מייתר את הגעת האם לגן, ובכך מצמצם את ההזדמנויות למפגש יומיומי עם הגננת.</w:t>
-      </w:r>
-    </w:p>
-    <w:p>
-      <w:pPr>
-        <w:pStyle w:val="Heading3"/>
-        <w:bidi w:val="1"/>
-        <w:jc w:val="right"/>
-      </w:pPr>
-      <w:r>
-        <w:rPr>
-          <w:cs/>
-        </w:rPr>
-        <w:t>ג. גודל הגן והמחסור בסייעות</w:t>
-      </w:r>
-    </w:p>
-    <w:p>
-      <w:pPr>
-        <w:bidi w:val="1"/>
-        <w:jc w:val="both"/>
-      </w:pPr>
-      <w:r>
-        <w:rPr>
-          <w:cs/>
-        </w:rPr>
-        <w:t>שתי משתתפות ציינו את מספר הילדים בכיתה כגורם המגביל את הקשר האישי. אם מוחמד ציינה שלושים ילדים בכיתה והוסיפה שקיים מחסור בסייעות. אם יוסף חזרה על אותו נתון וקשרה אותו ישירות לתקשורת: "יש לה שלושים תלמידים ושלושים אימהות, ולכל אם יש בעיה". אימאן העריכה שמספר הילדים בגן עולה על שלושים, ודיווחה על סייעת אחת בלבד: "כשאני באה לקחת את הילד אני רואה שהילדים רבים, אני מרגישה שהם למעלה משלושים, אני לא יודעת, אבל הרבה. ומסייעת ראיתי, אני חושבת שראיתי רק אחת".</w:t>
-      </w:r>
-    </w:p>
-    <w:p>
-      <w:pPr>
-        <w:bidi w:val="1"/>
-        <w:jc w:val="both"/>
-      </w:pPr>
-      <w:r>
-        <w:rPr>
-          <w:b/>
-          <w:cs/>
-        </w:rPr>
-        <w:t>סיכום הקטגוריה.</w:t>
-      </w:r>
-      <w:r>
-        <w:rPr>
-          <w:cs/>
-        </w:rPr>
-        <w:t xml:space="preserve"> האימהות מתארות רצון במעורבות שנתקל בחסמים מבניים: שעות עבודה שאינן חופפות לשעות הגן, מרחק ותשתיות, וכיתה צפופה עם מחסור בכוח אדם. אף אחת מהן לא תלתה את החסם בחוסר רצון של הגננת. משמעות הדבר לשאלת המחקר היא שמערכת היחסים בין ההורים לגננת בחברה הבדואית מוגבלת במידה רבה על ידי תנאים שאינם בשליטת שני הצדדים. מכאן שהאפשרות של הקשר להשפיע על הילד תלויה בכך שערוצי הקשר יותאמו לתנאים אלה.</w:t>
-      </w:r>
-    </w:p>
-    <w:p>
-      <w:pPr>
-        <w:pStyle w:val="Heading2"/>
-        <w:bidi w:val="1"/>
-        <w:jc w:val="right"/>
-      </w:pPr>
-      <w:r>
-        <w:rPr>
-          <w:cs/>
-        </w:rPr>
-        <w:t>קטגוריה 4: המידע שהאימהות מבקשות: מן הגן אל הילד</w:t>
-      </w:r>
-    </w:p>
-    <w:p>
-      <w:pPr>
-        <w:bidi w:val="1"/>
-        <w:jc w:val="both"/>
-      </w:pPr>
-      <w:r>
-        <w:rPr>
-          <w:cs/>
-        </w:rPr>
-        <w:t>כאשר נשאלו איזה מידע הן מבקשות לקבל מהגננת, המשתתפות הבחינו בין מידע על הגן, שאותו הן מקבלות, לבין מידע על ילדן, שחסר להן. שתיהן הציבו את מצבו הרגשי והחברתי של הילד לפני ההיבט הלימודי.</w:t>
-      </w:r>
-    </w:p>
-    <w:p>
-      <w:pPr>
-        <w:bidi w:val="1"/>
-        <w:jc w:val="both"/>
-      </w:pPr>
-      <w:r>
-        <w:rPr>
-          <w:cs/>
-        </w:rPr>
-        <w:t>אם יוסף ניסחה זאת במפורש:</w:t>
-      </w:r>
-    </w:p>
-    <w:p>
-      <w:pPr>
-        <w:bidi w:val="1"/>
-        <w:ind w:right="709" w:left="709"/>
-        <w:jc w:val="both"/>
-      </w:pPr>
-      <w:r>
-        <w:rPr>
-          <w:cs/>
-        </w:rPr>
-        <w:t>חשוב לי לראות איך הילד שלי מתנהג באופן כללי עם הילדים, איך הוא מתמודד עם עצמו. האם הוא שמח או עצוב. באופן כללי מצבו הנפשי חשוב לי יותר מהכול. וגם הקשרים החברתיים בכיתה.</w:t>
-      </w:r>
-    </w:p>
-    <w:p>
-      <w:pPr>
-        <w:bidi w:val="1"/>
-        <w:jc w:val="both"/>
-      </w:pPr>
-      <w:r>
-        <w:rPr>
-          <w:cs/>
-        </w:rPr>
-        <w:t>אצל אימאן הבקשה נקשרת למצב המשפחתי: "אני רוצה לראות מה מצבו עם שאר הילדים. את יודעת, האב לא נמצא בתמונה, והוא חסר בבית, והדבר הזה משפיע יותר על הילדים שלי. ואני לא רוצה שהילד שלי ירגיש בחסר כשהוא רואה שלשאר הילדים יש אבות". כששאלנו אותה אם חשוב לה לדעת אם הילד חש בכך בכיתה, הבהירה שמדובר גם ביכולת החברתית: "כלומר אם הוא יודע ליצור קשרים עם הילדים". לצד זאת היא הזכירה את ההיבט הלימודי ואת תחושת האחריות הבלעדית שלה: "וגם איך הוא בגן, כי בעזרת השם כשיסיים את הגן ויתחיל בית ספר שיהיה מוצלח בבית הספר. ואני זו שעוקבת אחריו, אין מי שיעקוב אחריו חוץ ממני".</w:t>
-      </w:r>
-    </w:p>
-    <w:p>
-      <w:pPr>
-        <w:bidi w:val="1"/>
-        <w:jc w:val="both"/>
-      </w:pPr>
-      <w:r>
-        <w:rPr>
-          <w:cs/>
-        </w:rPr>
-        <w:t>תדירות המידע היא הנקודה שבה שתיהן ביקשו שינוי. אימאן, שנשאלה מה הייתה רוצה שהגננת תשנה, השיבה:</w:t>
-      </w:r>
-    </w:p>
-    <w:p>
-      <w:pPr>
-        <w:bidi w:val="1"/>
-        <w:ind w:right="709" w:left="709"/>
-        <w:jc w:val="both"/>
-      </w:pPr>
-      <w:r>
-        <w:rPr>
-          <w:cs/>
-        </w:rPr>
-        <w:t>כמו שאמרתי לך, היא משתפת אותנו אבל לא יום יום. הייתי מייחלת שתוכל לשתף ולו תמונה ביום. את יודעת, אדם דואג לילד שלו וחושש כשהוא כל היום רחוק ממנו. אז אם תשתף כל יום תמונה, מה הילד עושה.</w:t>
-      </w:r>
-    </w:p>
-    <w:p>
-      <w:pPr>
-        <w:bidi w:val="1"/>
-        <w:jc w:val="both"/>
-      </w:pPr>
-      <w:r>
-        <w:rPr>
-          <w:cs/>
-        </w:rPr>
-        <w:t>אם יוסף תיארה תמונה דומה מזווית אחרת: "בוודאי שלא באופן יומי אני מקבלת את המידע שהילד שלי מצטלם בו בכיתה, אבל כשהיא משתפת, היא משתפת באופן מספיק". כלומר, השיתוף עצמו נתפס כמספק כשהוא מתרחש, והבעיה היא בתדירותו.</w:t>
-      </w:r>
-    </w:p>
-    <w:p>
-      <w:pPr>
-        <w:bidi w:val="1"/>
-        <w:jc w:val="both"/>
-      </w:pPr>
-      <w:r>
-        <w:rPr>
-          <w:b/>
-          <w:cs/>
-        </w:rPr>
-        <w:t>סיכום הקטגוריה.</w:t>
-      </w:r>
-      <w:r>
-        <w:rPr>
-          <w:cs/>
-        </w:rPr>
-        <w:t xml:space="preserve"> האימהות אינן מתלוננות על מחסור כללי במידע אלא על סוגו ועל תדירותו. הן מקבלות תיעוד של הגן כקבוצה ומבקשות ידיעה על ילדן כפרט, ובעיקר על מצבו הרגשי והחברתי. הבקשה המעשית שעלתה מן הראיונות היא מינימלית מבחינת המשאב הנדרש: תמונה אחת ביום. העובדה ששתי אימהות מיישובים שונים העלו את אותה בקשה, ושקדמו לה שאלות על מצבו הנפשי והחברתי של הילד ולא על הישגיו, מלמדת שמנקודת מבטן הקשר עם הגננת אמור לשרת קודם כול את הצורך לדעת שהילד בסדר.</w:t>
-      </w:r>
-    </w:p>
-    <w:p>
-      <w:pPr>
-        <w:pStyle w:val="Heading2"/>
-        <w:bidi w:val="1"/>
-        <w:jc w:val="right"/>
-      </w:pPr>
-      <w:r>
-        <w:rPr>
-          <w:cs/>
-        </w:rPr>
-        <w:t>קטגוריה 5: השפעת הקשר על תחושת הביטחון והשייכות של הילד</w:t>
-      </w:r>
-    </w:p>
-    <w:p>
-      <w:pPr>
-        <w:bidi w:val="1"/>
-        <w:jc w:val="both"/>
-      </w:pPr>
-      <w:r>
-        <w:rPr>
-          <w:cs/>
-        </w:rPr>
-        <w:t>קטגוריה זו נוגעת ישירות לשאלת המחקר. מדברי המשתתפות עולים שלושה היבטים: הרף הבסיסי של ביטחון הילד בגן, תרומת נוכחות ההורה לתחושת הביטחון של הילד, והגן כמרחב שמשלים את מה שחסר בבית.</w:t>
-      </w:r>
-    </w:p>
-    <w:p>
-      <w:pPr>
-        <w:pStyle w:val="Heading3"/>
-        <w:bidi w:val="1"/>
-        <w:jc w:val="right"/>
-      </w:pPr>
-      <w:r>
-        <w:rPr>
-          <w:cs/>
-        </w:rPr>
-        <w:t>א. הילד בטוח בגן: הרף הבסיסי</w:t>
-      </w:r>
-    </w:p>
-    <w:p>
-      <w:pPr>
-        <w:bidi w:val="1"/>
-        <w:jc w:val="both"/>
-      </w:pPr>
-      <w:r>
-        <w:rPr>
-          <w:cs/>
-        </w:rPr>
-        <w:t>כאשר נשאלו אם ילדיהן חשים בטוחים ושמחים בגן, שתי משתתפות השיבו בחיוב, ושתיהן הגדירו את הביטחון דרך היעדר פגיעה. אם מוחמד:</w:t>
-      </w:r>
-    </w:p>
-    <w:p>
-      <w:pPr>
-        <w:bidi w:val="1"/>
-        <w:ind w:right="709" w:left="709"/>
-        <w:jc w:val="both"/>
-      </w:pPr>
-      <w:r>
-        <w:rPr>
-          <w:cs/>
-        </w:rPr>
-        <w:t>כן, שמחה. אף אחד לא פוגע בה, אף אחד לא מכה. שמחה.</w:t>
-      </w:r>
-    </w:p>
-    <w:p>
-      <w:pPr>
-        <w:bidi w:val="1"/>
-        <w:jc w:val="both"/>
-      </w:pPr>
-      <w:r>
-        <w:rPr>
-          <w:cs/>
-        </w:rPr>
-        <w:t>אימאן תיארה את הביטחון דרך ההתנהגות היומיומית של הילד: "אני מרגישה שהילד שלי שמח בו, הוא הולך שמח, לא בוכה. כשהתחיל את הגן הוא בכה בימים הראשונים, ואחר כך הוא הולך שמח. בבוקר הוא לא מתווכח איתי, ברגע שהוא מתעורר הוא הולך לגן והוא שמח".</w:t>
-      </w:r>
-    </w:p>
-    <w:p>
-      <w:pPr>
-        <w:pStyle w:val="Heading3"/>
-        <w:bidi w:val="1"/>
-        <w:jc w:val="right"/>
-      </w:pPr>
-      <w:r>
-        <w:rPr>
-          <w:cs/>
-        </w:rPr>
-        <w:t>ב. נוכחות ההורה כמקור לביטחון ולשייכות</w:t>
-      </w:r>
-    </w:p>
-    <w:p>
-      <w:pPr>
-        <w:bidi w:val="1"/>
-        <w:jc w:val="both"/>
-      </w:pPr>
-      <w:r>
-        <w:rPr>
-          <w:cs/>
-        </w:rPr>
-        <w:t>אם יוסף קשרה במפורש בין נוכחות בני המשפחה בגן לבין תחושת הביטחון של הילד. כשנשאלה על יתרונות מעורבות ההורים השיבה:</w:t>
-      </w:r>
-    </w:p>
-    <w:p>
-      <w:pPr>
-        <w:bidi w:val="1"/>
-        <w:ind w:right="709" w:left="709"/>
-        <w:jc w:val="both"/>
-      </w:pPr>
-      <w:r>
-        <w:rPr>
-          <w:cs/>
-        </w:rPr>
-        <w:t>אני מרגישה שזה נותן לתלמיד, כשהוא רואה בני משפחה שלו, שתהיה המשפחה איתו, אז הוא מרגיש יותר, מרגיש בביטחון, כלומר כאילו הוא נמצא עם המשפחה שלו ועם הגננת.</w:t>
-      </w:r>
-    </w:p>
-    <w:p>
-      <w:pPr>
-        <w:bidi w:val="1"/>
-        <w:jc w:val="both"/>
-      </w:pPr>
-      <w:r>
-        <w:rPr>
-          <w:cs/>
-        </w:rPr>
-        <w:t>בדבריה, הביטחון נובע מכך שהגבול בין המשפחה לבין הגן נעשה פחות חד: הילד נמצא בו-זמנית עם משפחתו ועם הגננת. אם יוסף אף ניסחה זאת ברמה העקרונית בהמלצתה לגננת, כשאמרה שעל הגננת לשוחח עם ההורים מכיוון ש"הכיתה היא חלק מחיי ההורים, כי הילדים שלהם בה".</w:t>
-      </w:r>
-    </w:p>
-    <w:p>
-      <w:pPr>
-        <w:pStyle w:val="Heading3"/>
-        <w:bidi w:val="1"/>
-        <w:jc w:val="right"/>
-      </w:pPr>
-      <w:r>
-        <w:rPr>
-          <w:cs/>
-        </w:rPr>
-        <w:t>ג. הגן כמרחב שמשלים את הבית</w:t>
-      </w:r>
-    </w:p>
-    <w:p>
-      <w:pPr>
-        <w:bidi w:val="1"/>
-        <w:jc w:val="both"/>
-      </w:pPr>
-      <w:r>
-        <w:rPr>
-          <w:cs/>
-        </w:rPr>
-        <w:t>אימאן תיארה את מעורבות ההורים כהזדמנות ליחסים שלא מתקיימים בבית:</w:t>
-      </w:r>
-    </w:p>
-    <w:p>
-      <w:pPr>
-        <w:bidi w:val="1"/>
-        <w:ind w:right="709" w:left="709"/>
-        <w:jc w:val="both"/>
-      </w:pPr>
-      <w:r>
-        <w:rPr>
-          <w:cs/>
-        </w:rPr>
-        <w:t>הילדים יושבים בערך שמונה שעות כל יום בגן, רחוק מההורים. אז כשאנחנו באים ומשתתפים איתם, כי הגננת נותנת לנו מקום ועושה לנו פעילויות, זה יכול לחזק את הקשר שלנו עם הילדים. כי בבית אין לנו את הפעילויות, שם אנחנו עושים פעילויות.</w:t>
-      </w:r>
-    </w:p>
-    <w:p>
-      <w:pPr>
-        <w:bidi w:val="1"/>
-        <w:jc w:val="both"/>
-      </w:pPr>
-      <w:r>
-        <w:rPr>
-          <w:cs/>
-        </w:rPr>
-        <w:t>המשתתפות תיארו גם את הצד ההפוך, שבו הקשר עם הגננת אינו מספק להן את מה שהילד עצמו אינו מוסר. הילד כמקור מידע נמצא מוגבל: אם מוחמד אמרה על בתה "לא תמיד, לפעמים היא מספרת לי מה קרה איתה", ואם יוסף תיארה זאת ביתר חריפות: "בהתחלה היה קשה מאוד, מאוד מאוד. הוא היה אומר שיחק, שיחק, שיחק בלבד, לא נתן לי פירוט ומידע על הגן". אימאן דיווחה על שיתוף רחב יותר מצד הילד, אך תחום בזמן ובמקום: "כשאני חוזרת מהגן, ברכב בדרך, אני שואלת אותו: מה עשית היום בגן? הוא משתף אותי, אומר לי: הגננת סיפרה לנו סיפור כך, הגננת שיחקה איתנו כך. אבל רק למרחק הדרך מהגן לבית, עד שנגיע הביתה".</w:t>
-      </w:r>
-    </w:p>
-    <w:p>
-      <w:pPr>
-        <w:bidi w:val="1"/>
-        <w:jc w:val="both"/>
-      </w:pPr>
-      <w:r>
-        <w:rPr>
-          <w:b/>
-          <w:cs/>
-        </w:rPr>
-        <w:t>סיכום הקטגוריה.</w:t>
-      </w:r>
-      <w:r>
-        <w:rPr>
-          <w:cs/>
-        </w:rPr>
-        <w:t xml:space="preserve"> מדברי המשתתפות עולה שתחושת הביטחון של הילד בגן נמדדת אצלן תחילה ברף בסיסי, היעדר פגיעה והיעדר בכי, ושלושת הילדים עומדים ברף זה. מעבר לרף הזה, האימהות מייחסות את חיזוק תחושת הביטחון והשייכות דווקא למפגש בין המשפחה לגן: כשהילד רואה את בני משפחתו בגן, הוא חש שהוא נמצא עם משפחתו ועם הגננת בעת ובעונה אחת. מנגד, מכיוון שהילד עצמו מוסר מידע חלקי בלבד, האם תלויה בגננת כדי לדעת אם הילד בסדר גם מעבר לרף הבסיסי. כאן נסגר המעגל עם הקטגוריות הקודמות: כאשר הערוץ קבוצתי ותדירותו נמוכה, האם נותרת עם מידע על הגן ובלי מידע על ילדה, וזהו בדיוק המידע שהיא מתארת כחשוב לה יותר מכול.</w:t>
-      </w:r>
-    </w:p>
-    <w:p>
-      <w:pPr>
-        <w:pStyle w:val="Heading2"/>
-        <w:bidi w:val="1"/>
-        <w:jc w:val="right"/>
-      </w:pPr>
-      <w:r>
-        <w:rPr>
-          <w:cs/>
-        </w:rPr>
-        <w:t>סיכום הממצאים</w:t>
-      </w:r>
-    </w:p>
-    <w:p>
-      <w:pPr>
-        <w:bidi w:val="1"/>
-        <w:jc w:val="both"/>
-      </w:pPr>
-      <w:r>
-        <w:rPr>
-          <w:cs/>
-        </w:rPr>
-        <w:t>חמש הקטגוריות מצטרפות לתמונה אחת. שלוש האימהות מייחסות חשיבות רבה לקשר עם הגננת, אך הקשר בפועל מתווך על ידי תנאי החיים שלהן: שעות עבודה, מרחק ותשתיות, וגן צפוף. שתיים מהן תיארו גננת זמינה ומגיבה, ואף הצדיקו את גבולות זמינותה בעומס המוטל עליה, ואילו השלישית הגדירה את הקשר כלא טוב, אם כי התיעוד נקטע לפני שפירטה. הערוץ המרכזי בשני הגנים שתוארו בפירוט הוא קבוצת וואטסאפ, המעבירה מידע על הגן כמסגרת ולא על הילד כפרט. המידע שהאימהות מבקשות הוא בראש ובראשונה רגשי וחברתי, והבקשה המעשית החוזרת היא לתמונה או לעדכון יומי. ולבסוף, האימהות קושרות את תחושת הביטחון והשייכות של הילד למפגש בין המשפחה לגן, ורואות במעורבותן בגן הזדמנות לחזק את הקשר עם ילדיהן, הזדמנות שתנאי חייהן מקשים עליהן לממש.</w:t>
-      </w:r>
-    </w:p>
-    <w:p>
-      <w:r>
-        <w:br w:type="page"/>
-      </w:r>
-    </w:p>
-    <w:p>
-      <w:pPr>
-        <w:pStyle w:val="Heading1"/>
-        <w:bidi w:val="1"/>
-        <w:jc w:val="right"/>
-      </w:pPr>
-      <w:r>
-        <w:rPr>
-          <w:cs/>
-        </w:rPr>
-        <w:t>פרק רביעי: דיון ורפלקציה</w:t>
-      </w:r>
-    </w:p>
-    <w:p>
-      <w:pPr>
-        <w:pStyle w:val="Heading2"/>
-        <w:bidi w:val="1"/>
-        <w:jc w:val="right"/>
-      </w:pPr>
-      <w:r>
-        <w:rPr>
-          <w:cs/>
-        </w:rPr>
-        <w:t>דיון</w:t>
-      </w:r>
-    </w:p>
-    <w:p>
-      <w:pPr>
-        <w:bidi w:val="1"/>
-        <w:jc w:val="both"/>
-      </w:pPr>
-      <w:r>
-        <w:rPr>
-          <w:cs/>
-        </w:rPr>
-        <w:t>מטרת המחקר הייתה לבחון כיצד משפיעה מערכת היחסים בין הורים לגננות על תחושת הביטחון והשייכות של ילדיהם בחברה הבדואית בישראל. שלוש אימהות מסוגי יישוב שונים בנגב רואיינו, וניתוח התוכן העלה חמש קטגוריות: ערוצי התקשורת ותדירותם, זמינות הגננת ואמון האם, חסמים למעורבות האם, המידע שהאימהות מבקשות, והשפעת הקשר על תחושת הביטחון והשייכות של הילד. פרק זה דן בממצאים לאור הספרות שנסקרה בפרק הראשון, מציע תשובה לשאלת המחקר, מציין את מגבלות המחקר ומציע המלצות יישומיות.</w:t>
-      </w:r>
-    </w:p>
-    <w:p>
-      <w:pPr>
-        <w:pStyle w:val="Heading3"/>
-        <w:bidi w:val="1"/>
-        <w:jc w:val="right"/>
-      </w:pPr>
-      <w:r>
-        <w:rPr>
-          <w:cs/>
-        </w:rPr>
-        <w:t>ערוץ קבוצתי במקום דיאלוג</w:t>
-      </w:r>
-    </w:p>
-    <w:p>
-      <w:pPr>
-        <w:bidi w:val="1"/>
-        <w:jc w:val="both"/>
-      </w:pPr>
-      <w:r>
-        <w:rPr>
-          <w:cs/>
-        </w:rPr>
-        <w:t>הממצא הראשון הוא שהקשר בין האימהות לגננת מתנהל ברובו בערוץ אחד, קבוצת הוואטסאפ, המעביר מידע על הגן כמסגרת אך לא על הילד כפרט. אם יוסף ניסחה זאת בחדות כשאמרה שרוב המידע הגיע רק בקבוצת הוואטסאפ ושמפגשים בכיתה היו נדירים מאוד. ממצא זה מתיישב עם ההבחנה בספרות בין מודלים של מעורבות הנמצאים על רצף שבין סבילות לפעילות. ערוץ שבו הגננת מפרסמת והורים מקבלים מציב את ההורים קרוב לעמדת "הצופים", שבה קיים גבול מובחן בינם לבין הגננת, והוא רחוק ממודל "הדיאלוג", שהוא תהליך מתמשך של שיח והיוועצות הדדית (אגם-בן-ארצי וגרינבנק, 2020; בנג'ו ובדיר, 2024).</w:t>
-      </w:r>
-    </w:p>
-    <w:p>
-      <w:pPr>
-        <w:bidi w:val="1"/>
-        <w:jc w:val="both"/>
-      </w:pPr>
-      <w:r>
-        <w:rPr>
-          <w:cs/>
-        </w:rPr>
-        <w:t>מרכזיותו של הוואטסאפ בממצאים אינה ייחודית לגנים שנחקרו כאן. מחקר איכותני שבחן את התקשורת בין גננות ערביות-בדואיות לבין הורים מצא אף הוא שהוואטסאפ הפך לאמצעי המרכזי לקיום הקשר עם המשפחות (Elkashalla et al., 2026). ההתאמה בין המחקרים מחזקת את ההנחה שמדובר בדפוס רווח בחינוך הבדואי בנגב ולא במקרה מקומי. הממצאים הנוכחיים מוסיפים לכך הסתייגות מהותית: הכלי שהפך למרכזי אינו נגיש באופן שווה לכל האימהות. אם יוסף, המתגוררת בכפר לא מוכר, תיארה שהתקשורת הייתה קשה לה מפני שלא תמיד היו לה חשמל ואינטרנט. כאשר ערוץ אחד נושא כמעט את כל המידע, כל הפסקה בתשתית היא הפסקה בקשר החינוכי.</w:t>
-      </w:r>
-    </w:p>
-    <w:p>
-      <w:pPr>
-        <w:bidi w:val="1"/>
-        <w:jc w:val="both"/>
-      </w:pPr>
-      <w:r>
-        <w:rPr>
-          <w:cs/>
-        </w:rPr>
-        <w:t>הספרות מציינת שתדירות הקשר ואיכות האינטראקציות משפיעות על מידת המעורבות הכוללת (Arnold et al., 2008), ושתיאום והדדיות בין המשפחה לגן יכולים להתקיים בכמה ערוצים במקביל (שופר-אנגלהרד, 2013). הממצאים מראים שבגנים שנחקרו ערוץ אחד מפותח ואילו האחרים כמעט אינם קיימים. אימאן דיווחה על שתיים או שלוש שיחות אישיות בלבד מתחילת השנה, ואם יוסף ציינה שמפגשים בכיתה היו נדירים. בהיעדר ערוץ אישי, המידע על הילד הבודד נותר תלוי במקריות.</w:t>
-      </w:r>
-    </w:p>
-    <w:p>
-      <w:pPr>
-        <w:pStyle w:val="Heading3"/>
-        <w:bidi w:val="1"/>
-        <w:jc w:val="right"/>
-      </w:pPr>
-      <w:r>
-        <w:rPr>
-          <w:cs/>
-        </w:rPr>
-        <w:t>אמון הנשען על זמינות, ולגיטימציה שהאימהות מעניקות לגבולותיה</w:t>
-      </w:r>
-    </w:p>
-    <w:p>
-      <w:pPr>
-        <w:bidi w:val="1"/>
-        <w:jc w:val="both"/>
-      </w:pPr>
-      <w:r>
-        <w:rPr>
-          <w:cs/>
-        </w:rPr>
-        <w:t>הממצא השני נוגע לאמון. שתיים מהמשתתפות תיארו גננת נגישה ומגיבה. אימאן ציינה שהגננת עונה תמיד, לעיתים אף בשעות הלילה, ואם יוסף תיארה גננת שמסרה לה מידע ביוזמתה בלי שנשאלה. עמדות חיוביות של גננות כלפי הורים אכן מתאפיינות בתקשורת פתוחה שיוצרת אווירה של אמון שבה ההורים חשים רצויים (אגם-בן-ארצי וגרינבנק, 2020), וההצלחה ביצירת קשרים מיטיבים תלויה בראש ובראשונה בתפיסה הערכית והמקצועית של הגננת (שופר-אנגלהרד, 2013).</w:t>
-      </w:r>
-    </w:p>
-    <w:p>
-      <w:pPr>
-        <w:bidi w:val="1"/>
-        <w:jc w:val="both"/>
-      </w:pPr>
-      <w:r>
-        <w:rPr>
-          <w:cs/>
-        </w:rPr>
-        <w:t>מעניין יותר הוא מה שהאימהות עשו עם גבולות הזמינות. אם יוסף ציינה שאחרי השעה שלוש או ארבע הגננת הפסיקה לענות, ומיד הוסיפה שהיא מבינה זאת משום שגם לגננת יש חיים פרטיים. את הירידה באיכות התקשורת באמצע השנה הסבירה בעומס, וציינה ששלושים תלמידים פירושם שלושים אימהות שלכל אחת מהן יש בעיה. גם את מיעוט ההזמנות להורים הסבירה באותו אופן. כלומר, האימהות אינן תובעות זמינות מלאה אלא מכירות במגבלותיה מראש. תפיסה זו מתכתבת עם הממצא שלפיו הורים מהחברה הערבית סבורים כי נכונות הגננת לאפשר את מעורבותם קשורה בגורמים שאינם בשליטתם (בנג'ו ובדיר, 2024), ועם המחקר שמצא כי הדימוי שההורים מייחסים לגננת מורכב, ומשלב הכרה בדרישות המקצוע עם הערכה שאינה אחידה (גילת ואחרים, 2017).</w:t>
-      </w:r>
-    </w:p>
-    <w:p>
-      <w:pPr>
-        <w:bidi w:val="1"/>
-        <w:jc w:val="both"/>
-      </w:pPr>
-      <w:r>
-        <w:rPr>
-          <w:cs/>
-        </w:rPr>
-        <w:t>מחקר שבחן את החינוך בחברה הערבית בישראל דרך תפיסותיהם של הורים מצא שיחסם של אנשי החינוך לילדים, כפי שההורים חווים אותו, ושיתופם של ההורים בקבלת החלטות הנוגעות לילדיהם הם מן הקטגוריות המרכזיות המעצבות את השותפות (Jorban et al., 2024). הממצאים הנוכחיים תואמים זאת: האימהות שיפטו את הגננת לפי מה שחוו, וההערכה החיובית שלהן נשענה על תחושה שהגננת מנסה להגיע אליהן, ולא על היקף המפגשים בפועל.</w:t>
-      </w:r>
-    </w:p>
-    <w:p>
-      <w:pPr>
-        <w:bidi w:val="1"/>
-        <w:jc w:val="both"/>
-      </w:pPr>
-      <w:r>
-        <w:rPr>
-          <w:cs/>
-        </w:rPr>
-        <w:t>מן העבר האחר, אם מוחמד הגדירה את הקשר כלא טוב וציינה שהיא פונה אל הגננת פעמים רבות. התיעוד נקטע לפני שפירטה, ולכן אי אפשר לקבוע מה עמד ביסוד הקושי. עם זאת, הצירוף שהיא מתארת, פנייה חוזרת מצד האם לצד הגדרת הקשר כלא טוב, מצביע על אפשרות שהאם יוזמת ואינה חשה מענה. הספרות מציינת שקשיי תקשורת, נטייה לשיפוטיות וחוסר אמון עלולים לפגוע בתחושת הערך העצמי של ההורה ולהקשות עליו להתגייס לטובת ילדו (אגם-בן-ארצי וגרינבנק, 2020). מחקר שבחן את הקשר בין גננות להורים דרך מושג ההון התרבותי מראה שלקשר יש רובד גלוי ורובד סמוי, ושבשניהם יש רווחים ועלויות לכל צד (נער וביברמן-שלו, 2021). המקרה של אם מוחמד ממחיש שאותו קשר עצמו עשוי להיחוות אחרת לחלוטין על ידי אימהות שונות באותה חברה.</w:t>
-      </w:r>
-    </w:p>
-    <w:p>
-      <w:pPr>
-        <w:pStyle w:val="Heading3"/>
-        <w:bidi w:val="1"/>
-        <w:jc w:val="right"/>
-      </w:pPr>
-      <w:r>
-        <w:rPr>
-          <w:cs/>
-        </w:rPr>
-        <w:t>חסמים מבניים והתאמת הערוץ</w:t>
-      </w:r>
-    </w:p>
-    <w:p>
-      <w:pPr>
-        <w:bidi w:val="1"/>
-        <w:jc w:val="both"/>
-      </w:pPr>
-      <w:r>
-        <w:rPr>
-          <w:cs/>
-        </w:rPr>
-        <w:t>הממצא השלישי הוא שהחסמים למעורבות האימהות הם מבניים ולא עמדתיים. אימאן תיארה פער שעות מדויק: בזמן שהיא בעבודה לא עולה בדעתה להתקשר, והגננת ממילא עסוקה עם הילדים, וכשהיא חוזרת הביתה הזמן שנותר הוא הערב, שאינו זמן מתאים. אותו חסם מנע ממנה להשתתף ביום ההורים היחיד שאליו הוזמנה. אם יוסף תיארה קושי בהגעה בשל המרחק, ובעיקר את היעדר החשמל והאינטרנט. שלוש המשתתפות ציינו כיתות של כשלושים ילדים, ושתיים מהן קשרו זאת במפורש למחסור בכוח אדם.</w:t>
-      </w:r>
-    </w:p>
-    <w:p>
-      <w:pPr>
-        <w:bidi w:val="1"/>
-        <w:jc w:val="both"/>
-      </w:pPr>
-      <w:r>
-        <w:rPr>
-          <w:cs/>
-        </w:rPr>
-        <w:t>ממצאים אלה מקבלים תימוכין ישירים בספרות על החברה הבדואית. מדיניות ממשלתית שהתאפיינה בקיפוח בתחומי החינוך, השיכון והפיתוח המוניציפלי (אבו-סעד, 2023) מגיעה, כפי שמראים הממצאים, עד לשיחה היומיומית בין אם לגננת. מחקר שבחן את יחסי המורים וההורים בחינוך הערבי-הבדואי מצא אף הוא חסמים מבניים ייחודיים לחברה זו, ובהם מחסור בחשמל ובתשתיות ופערים דיגיטליים, במיוחד בכפרים הלא מוכרים (אבו-גוידר, 2025). מחקר נוסף, שנערך בקרב מורים בכפרים הלא-מוכרים בנגב, מתאר כיצד האיסור החוקי על חיבור לתשתיות מים וחשמל מגביל ישירות את סוג הקשר שאפשר לקיים בין הצוות החינוכי למשפחות (Abu-Gweder &amp; Solomovich, 2025). במילים אחרות, מעמד התכנון של היישוב נוכח בתוך הקשר החינוכי עצמו.</w:t>
-      </w:r>
-    </w:p>
-    <w:p>
-      <w:pPr>
-        <w:bidi w:val="1"/>
-        <w:jc w:val="both"/>
-      </w:pPr>
-      <w:r>
-        <w:rPr>
-          <w:cs/>
-        </w:rPr>
-        <w:t>הפער בין תרבות הבית לתרבות הפדגוגית של הגן מוסיף רובד לחסמים אלה. מחקר שליווה גננות בכפר בדואי לא מוכר תיאר מתח בין פדגוגיה המעודדת חקר ושאילת שאלות לבין נורמות משפחתיות וקהילתיות המבססות את העברת הידע על התבוננות וחיקוי (אלעטאונה ואבריאל-אבני, 2017). בממצאים הנוכחיים מתח זה אינו עולה במישרין, אך הוא עשוי להסביר מדוע אם יוסף מדדה את איכות הגן בעיקר לפי החומר הלימודי שהועבר, בעוד שאת הציפייה לשיח על הילד עצמו ניסחה רק בהמשך הריאיון וכתשובה לשאלה מפורשת.</w:t>
-      </w:r>
-    </w:p>
-    <w:p>
-      <w:pPr>
-        <w:bidi w:val="1"/>
-        <w:jc w:val="both"/>
-      </w:pPr>
-      <w:r>
-        <w:rPr>
-          <w:cs/>
-        </w:rPr>
-        <w:t>חסם הזמן שתיארה אימאן ראוי לתשומת לב מיוחדת. מחקר שבחן 1,784 הורים לילדי גן מצא שקונפליקט העבודה-משפחה מתווך את הקשר בין איכות היחסים עם הגננת לבין בעיות ההתנהגות של הילד, כך שיחסים טובים עם הגננת מפחיתים את הקונפליקט ומעלים את תחושת המסוגלות ההורית (Liu et al., 2024). הממצאים כאן מצביעים על אותה מערכת בכיוון ההפוך: כאשר ערוצי הקשר אינם מותאמים לשעות העבודה של האם, העבודה אינה נסיבה חיצונית בלבד אלא הופכת לחסם שמונע מהקשר להיווצר מלכתחילה.</w:t>
-      </w:r>
-    </w:p>
-    <w:p>
-      <w:pPr>
-        <w:bidi w:val="1"/>
-        <w:jc w:val="both"/>
-      </w:pPr>
-      <w:r>
-        <w:rPr>
-          <w:cs/>
-        </w:rPr>
-        <w:t>הספרות מציינת שהורים בעלי הכנסה נמוכה והורים חד-הוריים נוטים להיות פחות מעורבים (ואזן-סיקרון ואחרים, 2014; Arnold et al., 2008). הממצאים מאפשרים לדייק ניסוח זה. שלוש המשתתפות נושאות לבדן באחריות לילדיהן, ואף אחת מהן לא הביעה חוסר עניין. להפך, אימאן ביקשה עדכון יומי, ואם יוסף המליצה על מפגשים חודשיים קבועים. ההבדל בין רצון ליכולת הוא העיקר כאן. ממצא זה מתיישב עם הטענה שכאשר ההורה חש שהגננת עושה מאמץ כן ליצירת קשר, עולה הסבירות שיהיה מעורב, גם כשמדובר בהורים מתרבויות שונות ואף כשלא הייתה להם מוטיבציה ראשונית (שופר-אנגלהרד, 2013), ועם ההדגשה שהתאמה לצורכי אוכלוסיית היעד היא תנאי להצלחתה של כל תוכנית (ואזן-סיקרון ואחרים, 2014).</w:t>
-      </w:r>
-    </w:p>
-    <w:p>
-      <w:pPr>
-        <w:pStyle w:val="Heading3"/>
-        <w:bidi w:val="1"/>
-        <w:jc w:val="right"/>
-      </w:pPr>
-      <w:r>
-        <w:rPr>
-          <w:cs/>
-        </w:rPr>
-        <w:t>המידע המבוקש: רגשי וחברתי לפני לימודי</w:t>
-      </w:r>
-    </w:p>
-    <w:p>
-      <w:pPr>
-        <w:bidi w:val="1"/>
-        <w:jc w:val="both"/>
-      </w:pPr>
-      <w:r>
-        <w:rPr>
-          <w:cs/>
-        </w:rPr>
-        <w:t>הממצא הרביעי הוא שהאימהות ביקשו מהגננת בראש ובראשונה מידע על מצבו הרגשי והחברתי של הילד. אם יוסף אמרה במפורש שמצבו הנפשי של בנה חשוב לה יותר מהכול, ומיד אחריו הזכירה את הקשרים החברתיים בכיתה. אימאן ביקשה לדעת מה מצבו של בנה עם שאר הילדים, וקשרה זאת להיעדרו של האב ולחשש שהילד ירגיש בחסר. רק לאחר מכן הזכירה את ההיבט הלימודי.</w:t>
-      </w:r>
-    </w:p>
-    <w:p>
-      <w:pPr>
-        <w:bidi w:val="1"/>
-        <w:jc w:val="both"/>
-      </w:pPr>
-      <w:r>
-        <w:rPr>
-          <w:cs/>
-        </w:rPr>
-        <w:t>ממצא זה מתיישב עם התפיסה שלעבודה עם הורים יש השפעה על התפקוד הרגשי-חברתי בגילים המוקדמים במיוחד (ואזן-סיקרון ואחרים, 2014), ועם ההבנה שמערכות יחסים קרובות עם מבוגרים משמעותיים יוצרות את הבסיס הרגשי המאפשר התפתחות תקינה (ארז, 2011). הוא מתכתב במיוחד עם מחקר שבחן את תפיסות ההורים את השותפות עם המוסד החינוכי בדגש על ההיבט הרגשי-חברתי, ומסקנתו שיש לפתח שותפות החורגת מההיבטים המנהליים ומתמקדת במיומנויות הרגשיות-חברתיות של הילד, ושהשותפות אינה בגדר המלצה אלא תנאי (ישראלאשווילי, 2025). האימהות במחקר הנוכחי, בלי להכיר את הספרות, ניסחו בדיוק את אותו סדר עדיפויות.</w:t>
-      </w:r>
-    </w:p>
-    <w:p>
-      <w:pPr>
-        <w:bidi w:val="1"/>
-        <w:jc w:val="both"/>
-      </w:pPr>
-      <w:r>
-        <w:rPr>
-          <w:cs/>
-        </w:rPr>
-        <w:t>חשיבותו של המידע הזה מתחדדת לנוכח ממצא נוסף: הילד עצמו אינו מקור מידע מהימן. אם יוסף תיארה שבנה אמר רק "שיחק, שיחק" ולא מסר פרטים, אם מוחמד ציינה שבתה מספרת רק לפעמים, ואימאן תיארה שיתוף התחום למשך הנסיעה מהגן הביתה. כאשר הילד מוסר מעט והערוץ עם הגננת קבוצתי, האם נותרת בלי מידע על ילדה. הבקשה המעשית שעלתה מכאן, תמונה אחת ביום, קטנה במונחי משאבים אך מבטאת מעבר מהודעה על הגן להודעה על הילד.</w:t>
-      </w:r>
-    </w:p>
-    <w:p>
-      <w:pPr>
-        <w:pStyle w:val="Heading3"/>
-        <w:bidi w:val="1"/>
-        <w:jc w:val="right"/>
-      </w:pPr>
-      <w:r>
-        <w:rPr>
-          <w:cs/>
-        </w:rPr>
-        <w:t>תשובה לשאלת המחקר</w:t>
-      </w:r>
-    </w:p>
-    <w:p>
-      <w:pPr>
-        <w:bidi w:val="1"/>
-        <w:jc w:val="both"/>
-      </w:pPr>
-      <w:r>
-        <w:rPr>
-          <w:cs/>
-        </w:rPr>
-        <w:t>הממצא החמישי מספק את התשובה לשאלת המחקר. מדברי האימהות עולה שמערכת היחסים עם הגננת משפיעה על תחושת הביטחון והשייכות של הילד בשלושה מסלולים.</w:t>
-      </w:r>
-    </w:p>
-    <w:p>
-      <w:pPr>
-        <w:bidi w:val="1"/>
-        <w:jc w:val="both"/>
-      </w:pPr>
-      <w:r>
-        <w:rPr>
-          <w:cs/>
-        </w:rPr>
-        <w:t>במסלול הראשון נמצא רף בסיסי של ביטחון, המוגדר על ידי האימהות כהיעדר פגיעה והיעדר בכי. אם מוחמד אמרה שבתה שמחה ושאיש אינו פוגע בה או מכה אותה, ואימאן תיארה ילד שהולך לגן שמח ואינו בוכה. רף זה נענה בשלושת המקרים, גם באותו מקרה שבו האם הגדירה את הקשר שלה עם הגננת כלא טוב. מכאן שהקשר בין ההורה לגננת אינו התנאי לביטחון הבסיסי של הילד בגן, אלא נוגע לרובד שמעליו.</w:t>
-      </w:r>
-    </w:p>
-    <w:p>
-      <w:pPr>
-        <w:bidi w:val="1"/>
-        <w:jc w:val="both"/>
-      </w:pPr>
-      <w:r>
-        <w:rPr>
-          <w:cs/>
-        </w:rPr>
-        <w:t>במסלול השני, הרובד שמעל הרף הבסיסי הוא תחושת השייכות, והיא נקשרת ישירות למפגש בין המשפחה לגן. אם יוסף ניסחה זאת בבהירות כשאמרה שכאשר הילד רואה את בני משפחתו בגן הוא מרגיש ביטחון רב יותר, כאילו הוא נמצא עם משפחתו ועם הגננת גם יחד. זהו ביטוי מדויק לרעיון ההמשכיות בין הסביבה הביתית לסביבת הגן (אגם-בן-ארצי וגרינבנק, 2020) ולממצא שלפיו הורים מעורבים מסייעים בבניית יחסים חיוביים בין הילדים לגננותיהם ומטפחים רגשות חיוביים כלפי הגן (Arnold et al., 2008). תחושת שייכות למסגרת ותפיסתה כמקום בטוח אף נקשרו בספרות לירידה בבעיות התנהגות (ארז, 2011).</w:t>
-      </w:r>
-    </w:p>
-    <w:p>
-      <w:pPr>
-        <w:bidi w:val="1"/>
-        <w:jc w:val="both"/>
-      </w:pPr>
-      <w:r>
-        <w:rPr>
-          <w:cs/>
-        </w:rPr>
-        <w:t>במסלול השלישי, הקשר עם הגננת משמש את האם ככלי לניטור מצבו של ילדה, ובכך משפיע על תחושת הביטחון שלה עצמה. מכיוון שהילד מוסר מידע חלקי, ומכיוון שהאם שוהה בגן זמן קצר או אינה שוהה בו כלל, הגננת היא המקור היחיד לידיעה אם הילד בסדר. אימאן תיארה את החשש שמתלווה לשהות ממושכת של הילד הרחק מההורה, ואת הבקשה לתמונה יומית כמענה לחשש הזה.</w:t>
-      </w:r>
-    </w:p>
-    <w:p>
-      <w:pPr>
-        <w:bidi w:val="1"/>
-        <w:jc w:val="both"/>
-      </w:pPr>
-      <w:r>
-        <w:rPr>
-          <w:cs/>
-        </w:rPr>
-        <w:t>שלושת המסלולים עולים בקנה אחד עם התפיסה האקולוגית, שלפיה הקשר בין ההורה לגננת אינו נפרד מרשת היחסים של הילד אלא חלק ממנה, וכל היחסים הקרובים בסביבתו קשורים לתוצאות ההתפתחותיות שלו בתחום החברתי ובתחום הלימודי (Weisberger &amp; Ziv, 2023). כמו כן, ההבחנה בין הקשר כפי שההורה חווה אותו לבין הקשר כפי שהגננת חווה אותו, שנמצאה משמעותית במחקר כמותי שכלל 167 גננות ו-1,019 ילדים והוריהם (Cai et al., 2024), מקבלת כאן ביטוי איכותני. המידע שהאימהות מחזיקות על ילדיהן, כמו היעדרו של האב במקרה של אימאן, אינו מגיע בהכרח לגננת, ולכן אינו יכול להיות מתורגם לפעולה בגן.</w:t>
-      </w:r>
-    </w:p>
-    <w:p>
-      <w:pPr>
-        <w:bidi w:val="1"/>
-        <w:jc w:val="both"/>
-      </w:pPr>
-      <w:r>
-        <w:rPr>
-          <w:cs/>
-        </w:rPr>
-        <w:t>התשובה לשאלת המחקר היא אפוא שמערכת היחסים בין ההורים לגננות בחברה הבדואית משפיעה על תחושת הביטחון והשייכות של הילד בעיקר מעל לרף הבסיסי של הביטחון הפיזי: היא מחזקת את תחושת השייכות כאשר היא מביאה את המשפחה אל תוך הגן, והיא מרגיעה את האם ובכך משפיעה בעקיפין על הילד. שני המסלולים תלויים בקיומו של ערוץ אישי בין האם לגננת, ובחברה הבדואית קיומו של ערוץ כזה תלוי במידה רבה בהתאמתו לתנאי החיים של האם: לשעות עבודתה, למרחק מהגן ולזמינות התשתיות ביישובה.</w:t>
-      </w:r>
-    </w:p>
-    <w:p>
-      <w:pPr>
-        <w:pStyle w:val="Heading3"/>
-        <w:bidi w:val="1"/>
-        <w:jc w:val="right"/>
-      </w:pPr>
-      <w:r>
-        <w:rPr>
-          <w:cs/>
-        </w:rPr>
-        <w:t>מגבלות המחקר</w:t>
-      </w:r>
-    </w:p>
-    <w:p>
-      <w:pPr>
-        <w:bidi w:val="1"/>
-        <w:jc w:val="both"/>
-      </w:pPr>
-      <w:r>
-        <w:rPr>
-          <w:cs/>
-        </w:rPr>
-        <w:t>למחקר כמה מגבלות. ראשית, השתתפו בו שלוש אימהות בלבד, והממצאים אינם ניתנים להכללה על כלל האימהות בחברה הבדואית. שנית, הראיונות היו קצרים, ומגבלה זו צמצמה את היכולת להעמיק בתשובות ולשאול שאלות המשך. שלישית, הריאיון עם אם מוחמד נקטע בדיוק בנקודה החשובה ביותר לענייננו, כשהחלה להסביר מדוע הקשר עם הגננת אינו טוב, ולכן העדות היחידה על קשר בעייתי נותרה חלקית. רביעית, לא נאספו נתוני רקע מלאים מכל המשתתפות, ובכלל זה שנות לימוד ומספר הסייעות בגן, ולכן הטבלה בפרק השיטה חסרה. חמישית, נשמע רק קולן של האימהות. הגננות, שכל המשתתפות תיארו כמי שפועלות בתנאים קשים, לא רואיינו. שישית, הראיונות תורגמו מערבית לעברית, ותרגום עלול לאבד ניואנסים של הניב המדובר. לבסוף, האבות לא רואיינו, אף שבמשפחה הבדואית המסורתית, המתוארת כפטריארכלית והיררכית (יפה וחראנבה, 2019), עמדתם עשויה להשפיע על מידת המעורבות של האם.</w:t>
-      </w:r>
-    </w:p>
-    <w:p>
-      <w:pPr>
-        <w:pStyle w:val="Heading3"/>
-        <w:bidi w:val="1"/>
-        <w:jc w:val="right"/>
-      </w:pPr>
-      <w:r>
-        <w:rPr>
-          <w:cs/>
-        </w:rPr>
-        <w:t>המלצות יישומיות</w:t>
-      </w:r>
-    </w:p>
-    <w:p>
-      <w:pPr>
-        <w:bidi w:val="1"/>
-        <w:jc w:val="both"/>
-      </w:pPr>
-      <w:r>
-        <w:rPr>
-          <w:cs/>
-        </w:rPr>
-        <w:t>מהממצאים עולות כמה המלצות מעשיות לגננות בגנים בחברה הבדואית ולמערכת המפעילה אותם.</w:t>
-      </w:r>
-    </w:p>
-    <w:p>
-      <w:pPr>
-        <w:bidi w:val="1"/>
-        <w:jc w:val="both"/>
-      </w:pPr>
-      <w:r>
-        <w:rPr>
-          <w:cs/>
-        </w:rPr>
-        <w:t>1. עדכון אישי קצר וקבוע על כל ילד, ולו משפט אחד או תמונה אחת בשבוע, המתמקד במצבו הרגשי והחברתי ולא בפעילות הגן. זו הבקשה המפורשת שעלתה מהראיונות, והיא ההשקעה הקטנה ביותר שתעביר את הערוץ מרמת הגן לרמת הילד.</w:t>
-      </w:r>
-    </w:p>
-    <w:p>
-      <w:pPr>
-        <w:bidi w:val="1"/>
-        <w:jc w:val="both"/>
-      </w:pPr>
-      <w:r>
-        <w:rPr>
-          <w:cs/>
-        </w:rPr>
-        <w:t>2. שעת קבלה טלפונית קבועה וידועה מראש, למשל שעה אחת בשבוע, כדי שאימהות עובדות יוכלו לתכנן את הפנייה במקום להתקשר בערב, בזמן שהן עצמן מגדירות כלא מתאים.</w:t>
-      </w:r>
-    </w:p>
-    <w:p>
-      <w:pPr>
-        <w:bidi w:val="1"/>
-        <w:jc w:val="both"/>
-      </w:pPr>
-      <w:r>
-        <w:rPr>
-          <w:cs/>
-        </w:rPr>
-        <w:t>3. ערוץ חלופי לאימהות שאין להן חשמל ואינטרנט רציפים. פתק בתיק הילד או שיחת טלפון יזומה עבור הודעות חיוניות, וכן הודעה מוקדמת של שבוע על אירועים בגן במקום יום מראש.</w:t>
+        <w:t>3. ערוץ חלופי לאימהות שאין להן חשמל ואינטרנט רציפים. פתק בתיק הילד או שיחת טלפון יזומה עבור הודעות שאי אפשר להחמיץ, וכן הודעה מוקדמת של שבוע על אירועים בגן במקום יום מראש.</w:t>
       </w:r>
     </w:p>
     <w:p>

</xml_diff>